<commit_message>
Mejora la pauta de testeo y añade guía de uso
</commit_message>
<xml_diff>
--- a/07_validacion/instrumentos/pauta-testeo-contextual-dos-dias.docx
+++ b/07_validacion/instrumentos/pauta-testeo-contextual-dos-dias.docx
@@ -7,7 +7,10 @@
         <w:pStyle w:val="Title"/>
       </w:pPr>
       <w:r>
-        <w:t>Pauta de testeo contextual de Relevo</w:t>
+        <w:rPr>
+          <w:rFonts w:ascii="Arial" w:hAnsi="Arial" w:eastAsia="Arial"/>
+        </w:rPr>
+        <w:t>Pauta para probar Relevo durante dos días</w:t>
       </w:r>
     </w:p>
     <w:p>
@@ -16,12 +19,9 @@
       </w:pPr>
       <w:r>
         <w:rPr>
-          <w:rFonts w:ascii="Aptos" w:hAnsi="Aptos"/>
-          <w:b w:val="0"/>
-          <w:color w:val="666666"/>
-          <w:sz w:val="26"/>
+          <w:rFonts w:ascii="Arial" w:hAnsi="Arial" w:eastAsia="Arial"/>
         </w:rPr>
-        <w:t>Registro individual de uso durante dos días</w:t>
+        <w:t>Una hoja de registro por persona</w:t>
       </w:r>
     </w:p>
     <w:p>
@@ -30,12 +30,9 @@
       </w:pPr>
       <w:r>
         <w:rPr>
-          <w:rFonts w:ascii="Aptos" w:hAnsi="Aptos"/>
-          <w:b w:val="0"/>
-          <w:color w:val="1F1F1F"/>
-          <w:sz w:val="21"/>
+          <w:rFonts w:ascii="Arial" w:hAnsi="Arial" w:eastAsia="Arial"/>
         </w:rPr>
-        <w:t>Este instrumento permite registrar una experiencia de uso de Relevo en un contexto cotidiano. Debe completarse una copia por participante. La prueba considera una actividad real cada día, una señal emitida mediante un mini parlante Bluetooth y un periodo de observación de hasta diez minutos después de la activación.</w:t>
+        <w:t>Relevo ayuda a una persona a retomar una actividad que ella misma quiere hacer. Desde la aplicación puede elegir esa actividad, definir un primer paso y programar una señal. El pequeño dispositivo se deja junto a un objeto relacionado. Cuando suena, la persona reconoce el lugar y decide si quiere comenzar.</w:t>
       </w:r>
     </w:p>
     <w:p>
@@ -43,32 +40,187 @@
         <w:spacing w:after="120"/>
       </w:pPr>
       <w:r>
-        <w:rPr>
-          <w:rFonts w:ascii="Aptos" w:hAnsi="Aptos"/>
-          <w:b/>
-          <w:color w:val="1F1F1F"/>
-          <w:sz w:val="21"/>
-        </w:rPr>
-        <w:t>Alcance.</w:t>
+        <w:t>Esta pauta sirve para observar si la señal se entiende, si ayuda a recordar la intención y si facilita un primer paso. Con dos personas podremos obtener aprendizajes para mejorar el prototipo, pero no podremos afirmar que funciona para todas las personas.</w:t>
       </w:r>
+    </w:p>
+    <w:p>
+      <w:pPr>
+        <w:pStyle w:val="Heading1"/>
+        <w:pageBreakBefore w:val="0"/>
+      </w:pPr>
       <w:r>
         <w:rPr>
-          <w:rFonts w:ascii="Aptos" w:hAnsi="Aptos"/>
-          <w:b w:val="0"/>
-          <w:color w:val="1F1F1F"/>
-          <w:sz w:val="21"/>
+          <w:rFonts w:ascii="Arial" w:hAnsi="Arial" w:eastAsia="Arial"/>
         </w:rPr>
-        <w:t xml:space="preserve"> Los resultados permiten revisar comprensión, interacción y utilidad percibida. Dos participantes no permiten demostrar eficacia general ni establecer conclusiones estadísticas.</w:t>
+        <w:t>Cómo funciona Relevo</w:t>
+      </w:r>
+    </w:p>
+    <w:p>
+      <w:pPr>
+        <w:pageBreakBefore w:val="0"/>
+      </w:pPr>
+      <w:r>
+        <w:rPr>
+          <w:rFonts w:ascii="Arial" w:hAnsi="Arial" w:eastAsia="Arial"/>
+        </w:rPr>
+        <w:t>La persona elige algo que quiere hacer y lo relaciona con un objeto cercano. Relevo guarda esa intención y, después del tiempo programado, hace sonar el dispositivo que quedó junto al objeto. La señal no obliga a actuar: ayuda a recordar el plan en el lugar donde puede comenzar.</w:t>
+      </w:r>
+    </w:p>
+    <w:p>
+      <w:pPr>
+        <w:pStyle w:val="Heading2"/>
+        <w:pageBreakBefore w:val="0"/>
+      </w:pPr>
+      <w:r>
+        <w:rPr>
+          <w:rFonts w:ascii="Arial" w:hAnsi="Arial" w:eastAsia="Arial"/>
+        </w:rPr>
+        <w:t>Guía rápida</w:t>
+      </w:r>
+    </w:p>
+    <w:p>
+      <w:pPr>
+        <w:pageBreakBefore w:val="0"/>
+      </w:pPr>
+      <w:r>
+        <w:rPr>
+          <w:rFonts w:ascii="Arial" w:hAnsi="Arial" w:eastAsia="Arial"/>
+        </w:rPr>
+        <w:t>1  Elegir una actividad que la persona realmente quiera comenzar.</w:t>
+      </w:r>
+    </w:p>
+    <w:p>
+      <w:pPr>
+        <w:pageBreakBefore w:val="0"/>
+      </w:pPr>
+      <w:r>
+        <w:rPr>
+          <w:rFonts w:ascii="Arial" w:hAnsi="Arial" w:eastAsia="Arial"/>
+        </w:rPr>
+        <w:t>2  Definir un primer paso concreto, por ejemplo ponerse las zapatillas.</w:t>
+      </w:r>
+    </w:p>
+    <w:p>
+      <w:pPr>
+        <w:pageBreakBefore w:val="0"/>
+      </w:pPr>
+      <w:r>
+        <w:rPr>
+          <w:rFonts w:ascii="Arial" w:hAnsi="Arial" w:eastAsia="Arial"/>
+        </w:rPr>
+        <w:t>3  Dejar el dispositivo junto a un objeto relacionado y programar el tiempo en la aplicación.</w:t>
+      </w:r>
+    </w:p>
+    <w:p>
+      <w:pPr>
+        <w:pageBreakBefore w:val="0"/>
+      </w:pPr>
+      <w:r>
+        <w:rPr>
+          <w:rFonts w:ascii="Arial" w:hAnsi="Arial" w:eastAsia="Arial"/>
+        </w:rPr>
+        <w:t>4  Cuando suene, acercarse al objeto, recordar la intención y decidir qué hacer.</w:t>
+      </w:r>
+    </w:p>
+    <w:p>
+      <w:pPr>
+        <w:pStyle w:val="Heading2"/>
+        <w:pageBreakBefore w:val="0"/>
+      </w:pPr>
+      <w:r>
+        <w:rPr>
+          <w:rFonts w:ascii="Arial" w:hAnsi="Arial" w:eastAsia="Arial"/>
+        </w:rPr>
+        <w:t>A quién invitar</w:t>
+      </w:r>
+    </w:p>
+    <w:p>
+      <w:pPr>
+        <w:pageBreakBefore w:val="0"/>
+      </w:pPr>
+      <w:r>
+        <w:rPr>
+          <w:rFonts w:ascii="Arial" w:hAnsi="Arial" w:eastAsia="Arial"/>
+        </w:rPr>
+        <w:t>Puede participar una amistad o una persona conocida. Debe tener entre 18 y 30 años, poder rechazar la invitación sin consecuencias y reconocer una actividad que quiera retomar durante los dos días de prueba. Registra que el reclutamiento se hizo mediante la red personal.</w:t>
+      </w:r>
+    </w:p>
+    <w:p>
+      <w:pPr>
+        <w:pageBreakBefore w:val="0"/>
+      </w:pPr>
+      <w:r>
+        <w:rPr>
+          <w:rFonts w:ascii="Arial" w:hAnsi="Arial" w:eastAsia="Arial"/>
+        </w:rPr>
+        <w:t>[ ] Tiene entre 18 y 30 años.</w:t>
+      </w:r>
+    </w:p>
+    <w:p>
+      <w:pPr>
+        <w:pageBreakBefore w:val="0"/>
+      </w:pPr>
+      <w:r>
+        <w:rPr>
+          <w:rFonts w:ascii="Arial" w:hAnsi="Arial" w:eastAsia="Arial"/>
+        </w:rPr>
+        <w:t>[ ] Identifica una actividad propia que desea comenzar.</w:t>
+      </w:r>
+    </w:p>
+    <w:p>
+      <w:pPr>
+        <w:pageBreakBefore w:val="0"/>
+      </w:pPr>
+      <w:r>
+        <w:rPr>
+          <w:rFonts w:ascii="Arial" w:hAnsi="Arial" w:eastAsia="Arial"/>
+        </w:rPr>
+        <w:t>[ ] A veces continúa con ocio digital aunque quiera pasar a otra actividad.</w:t>
+      </w:r>
+    </w:p>
+    <w:p>
+      <w:pPr>
+        <w:pageBreakBefore w:val="0"/>
+      </w:pPr>
+      <w:r>
+        <w:rPr>
+          <w:rFonts w:ascii="Arial" w:hAnsi="Arial" w:eastAsia="Arial"/>
+        </w:rPr>
+        <w:t>[ ] Puede participar durante dos días y acepta hacerlo voluntariamente.</w:t>
+      </w:r>
+    </w:p>
+    <w:p>
+      <w:pPr>
+        <w:pStyle w:val="Heading2"/>
+        <w:pageBreakBefore w:val="0"/>
+      </w:pPr>
+      <w:r>
+        <w:rPr>
+          <w:rFonts w:ascii="Arial" w:hAnsi="Arial" w:eastAsia="Arial"/>
+        </w:rPr>
+        <w:t>Si algo falla durante la prueba</w:t>
+      </w:r>
+    </w:p>
+    <w:p>
+      <w:pPr>
+        <w:pageBreakBefore w:val="0"/>
+      </w:pPr>
+      <w:r>
+        <w:rPr>
+          <w:rFonts w:ascii="Arial" w:hAnsi="Arial" w:eastAsia="Arial"/>
+        </w:rPr>
+        <w:t>Revisa Bluetooth, batería y volumen. Si la señal no llegó a percibirse, puedes repetirla una sola vez y anotar el fallo. Si la persona se siente incómoda o quiere detenerse, termina la sesión. No expliques una reacción confusa mientras ocurre: regístrala y pregúntala después.</w:t>
       </w:r>
     </w:p>
     <w:p>
       <w:pPr>
         <w:pStyle w:val="Heading1"/>
         <w:keepNext/>
+        <w:pageBreakBefore/>
       </w:pPr>
       <w:r>
         <w:rPr>
-          <w:rFonts w:ascii="Aptos" w:hAnsi="Aptos"/>
+          <w:rFonts w:ascii="Arial" w:hAnsi="Arial" w:eastAsia="Arial"/>
           <w:b/>
           <w:color w:val="1F1F1F"/>
           <w:sz w:val="30"/>
@@ -110,7 +262,7 @@
           <w:p>
             <w:r>
               <w:rPr>
-                <w:rFonts w:ascii="Aptos" w:hAnsi="Aptos"/>
+                <w:rFonts w:ascii="Arial" w:hAnsi="Arial" w:eastAsia="Arial"/>
                 <w:b/>
                 <w:color w:val="1F1F1F"/>
                 <w:sz w:val="19"/>
@@ -118,11 +270,14 @@
               <w:t>Código de participante  [ ] P01   [ ] P02</w:t>
             </w:r>
             <w:r>
+              <w:rPr>
+                <w:rFonts w:ascii="Arial" w:hAnsi="Arial" w:eastAsia="Arial"/>
+              </w:rPr>
               <w:br/>
             </w:r>
             <w:r>
               <w:rPr>
-                <w:rFonts w:ascii="Aptos" w:hAnsi="Aptos"/>
+                <w:rFonts w:ascii="Arial" w:hAnsi="Arial" w:eastAsia="Arial"/>
                 <w:b w:val="0"/>
                 <w:color w:val="1F1F1F"/>
                 <w:sz w:val="21"/>
@@ -153,19 +308,98 @@
           <w:p>
             <w:r>
               <w:rPr>
-                <w:rFonts w:ascii="Aptos" w:hAnsi="Aptos"/>
+                <w:rFonts w:ascii="Arial" w:hAnsi="Arial" w:eastAsia="Arial"/>
+              </w:rPr>
+              <w:t>Nombre o seudónimo para coordinar (no publicar)</w:t>
+            </w:r>
+          </w:p>
+        </w:tc>
+      </w:tr>
+      <w:tr>
+        <w:tc>
+          <w:tcPr>
+            <w:tcW w:type="dxa" w:w="4592"/>
+            <w:tcBorders>
+              <w:top w:val="single" w:sz="6" w:space="0" w:color="D9D9D9"/>
+              <w:left w:val="single" w:sz="6" w:space="0" w:color="D9D9D9"/>
+              <w:bottom w:val="single" w:sz="6" w:space="0" w:color="D9D9D9"/>
+              <w:right w:val="single" w:sz="6" w:space="0" w:color="D9D9D9"/>
+              <w:insideH w:val="single" w:sz="6" w:space="0" w:color="D9D9D9"/>
+              <w:insideV w:val="single" w:sz="6" w:space="0" w:color="D9D9D9"/>
+            </w:tcBorders>
+            <w:tcMar>
+              <w:top w:w="110" w:type="dxa"/>
+              <w:start w:w="140" w:type="dxa"/>
+              <w:bottom w:w="140" w:type="dxa"/>
+              <w:end w:w="140" w:type="dxa"/>
+            </w:tcMar>
+            <w:vAlign w:val="center"/>
+          </w:tcPr>
+          <w:p>
+            <w:r>
+              <w:rPr>
+                <w:rFonts w:ascii="Arial" w:hAnsi="Arial" w:eastAsia="Arial"/>
                 <w:b/>
                 <w:color w:val="1F1F1F"/>
                 <w:sz w:val="19"/>
               </w:rPr>
-              <w:t>Nombre completo</w:t>
+              <w:t>Edad</w:t>
             </w:r>
             <w:r>
+              <w:rPr>
+                <w:rFonts w:ascii="Arial" w:hAnsi="Arial" w:eastAsia="Arial"/>
+              </w:rPr>
               <w:br/>
             </w:r>
             <w:r>
               <w:rPr>
-                <w:rFonts w:ascii="Aptos" w:hAnsi="Aptos"/>
+                <w:rFonts w:ascii="Arial" w:hAnsi="Arial" w:eastAsia="Arial"/>
+                <w:b w:val="0"/>
+                <w:color w:val="1F1F1F"/>
+                <w:sz w:val="21"/>
+              </w:rPr>
+              <w:t xml:space="preserve"> </w:t>
+            </w:r>
+          </w:p>
+        </w:tc>
+        <w:tc>
+          <w:tcPr>
+            <w:tcW w:type="dxa" w:w="4592"/>
+            <w:tcBorders>
+              <w:top w:val="single" w:sz="6" w:space="0" w:color="D9D9D9"/>
+              <w:left w:val="single" w:sz="6" w:space="0" w:color="D9D9D9"/>
+              <w:bottom w:val="single" w:sz="6" w:space="0" w:color="D9D9D9"/>
+              <w:right w:val="single" w:sz="6" w:space="0" w:color="D9D9D9"/>
+              <w:insideH w:val="single" w:sz="6" w:space="0" w:color="D9D9D9"/>
+              <w:insideV w:val="single" w:sz="6" w:space="0" w:color="D9D9D9"/>
+            </w:tcBorders>
+            <w:tcMar>
+              <w:top w:w="110" w:type="dxa"/>
+              <w:start w:w="140" w:type="dxa"/>
+              <w:bottom w:w="140" w:type="dxa"/>
+              <w:end w:w="140" w:type="dxa"/>
+            </w:tcMar>
+            <w:vAlign w:val="center"/>
+          </w:tcPr>
+          <w:p>
+            <w:r>
+              <w:rPr>
+                <w:rFonts w:ascii="Arial" w:hAnsi="Arial" w:eastAsia="Arial"/>
+                <w:b/>
+                <w:color w:val="1F1F1F"/>
+                <w:sz w:val="19"/>
+              </w:rPr>
+              <w:t>Fecha de inicio</w:t>
+            </w:r>
+            <w:r>
+              <w:rPr>
+                <w:rFonts w:ascii="Arial" w:hAnsi="Arial" w:eastAsia="Arial"/>
+              </w:rPr>
+              <w:br/>
+            </w:r>
+            <w:r>
+              <w:rPr>
+                <w:rFonts w:ascii="Arial" w:hAnsi="Arial" w:eastAsia="Arial"/>
                 <w:b w:val="0"/>
                 <w:color w:val="1F1F1F"/>
                 <w:sz w:val="21"/>
@@ -198,19 +432,22 @@
           <w:p>
             <w:r>
               <w:rPr>
-                <w:rFonts w:ascii="Aptos" w:hAnsi="Aptos"/>
+                <w:rFonts w:ascii="Arial" w:hAnsi="Arial" w:eastAsia="Arial"/>
                 <w:b/>
                 <w:color w:val="1F1F1F"/>
                 <w:sz w:val="19"/>
               </w:rPr>
-              <w:t>Edad</w:t>
+              <w:t>Fecha de cierre</w:t>
             </w:r>
             <w:r>
+              <w:rPr>
+                <w:rFonts w:ascii="Arial" w:hAnsi="Arial" w:eastAsia="Arial"/>
+              </w:rPr>
               <w:br/>
             </w:r>
             <w:r>
               <w:rPr>
-                <w:rFonts w:ascii="Aptos" w:hAnsi="Aptos"/>
+                <w:rFonts w:ascii="Arial" w:hAnsi="Arial" w:eastAsia="Arial"/>
                 <w:b w:val="0"/>
                 <w:color w:val="1F1F1F"/>
                 <w:sz w:val="21"/>
@@ -241,95 +478,7 @@
           <w:p>
             <w:r>
               <w:rPr>
-                <w:rFonts w:ascii="Aptos" w:hAnsi="Aptos"/>
-                <w:b/>
-                <w:color w:val="1F1F1F"/>
-                <w:sz w:val="19"/>
-              </w:rPr>
-              <w:t>Fecha de inicio</w:t>
-            </w:r>
-            <w:r>
-              <w:br/>
-            </w:r>
-            <w:r>
-              <w:rPr>
-                <w:rFonts w:ascii="Aptos" w:hAnsi="Aptos"/>
-                <w:b w:val="0"/>
-                <w:color w:val="1F1F1F"/>
-                <w:sz w:val="21"/>
-              </w:rPr>
-              <w:t xml:space="preserve"> </w:t>
-            </w:r>
-          </w:p>
-        </w:tc>
-      </w:tr>
-      <w:tr>
-        <w:tc>
-          <w:tcPr>
-            <w:tcW w:type="dxa" w:w="4592"/>
-            <w:tcBorders>
-              <w:top w:val="single" w:sz="6" w:space="0" w:color="D9D9D9"/>
-              <w:left w:val="single" w:sz="6" w:space="0" w:color="D9D9D9"/>
-              <w:bottom w:val="single" w:sz="6" w:space="0" w:color="D9D9D9"/>
-              <w:right w:val="single" w:sz="6" w:space="0" w:color="D9D9D9"/>
-              <w:insideH w:val="single" w:sz="6" w:space="0" w:color="D9D9D9"/>
-              <w:insideV w:val="single" w:sz="6" w:space="0" w:color="D9D9D9"/>
-            </w:tcBorders>
-            <w:tcMar>
-              <w:top w:w="110" w:type="dxa"/>
-              <w:start w:w="140" w:type="dxa"/>
-              <w:bottom w:w="140" w:type="dxa"/>
-              <w:end w:w="140" w:type="dxa"/>
-            </w:tcMar>
-            <w:vAlign w:val="center"/>
-          </w:tcPr>
-          <w:p>
-            <w:r>
-              <w:rPr>
-                <w:rFonts w:ascii="Aptos" w:hAnsi="Aptos"/>
-                <w:b/>
-                <w:color w:val="1F1F1F"/>
-                <w:sz w:val="19"/>
-              </w:rPr>
-              <w:t>Fecha de cierre</w:t>
-            </w:r>
-            <w:r>
-              <w:br/>
-            </w:r>
-            <w:r>
-              <w:rPr>
-                <w:rFonts w:ascii="Aptos" w:hAnsi="Aptos"/>
-                <w:b w:val="0"/>
-                <w:color w:val="1F1F1F"/>
-                <w:sz w:val="21"/>
-              </w:rPr>
-              <w:t xml:space="preserve"> </w:t>
-            </w:r>
-          </w:p>
-        </w:tc>
-        <w:tc>
-          <w:tcPr>
-            <w:tcW w:type="dxa" w:w="4592"/>
-            <w:tcBorders>
-              <w:top w:val="single" w:sz="6" w:space="0" w:color="D9D9D9"/>
-              <w:left w:val="single" w:sz="6" w:space="0" w:color="D9D9D9"/>
-              <w:bottom w:val="single" w:sz="6" w:space="0" w:color="D9D9D9"/>
-              <w:right w:val="single" w:sz="6" w:space="0" w:color="D9D9D9"/>
-              <w:insideH w:val="single" w:sz="6" w:space="0" w:color="D9D9D9"/>
-              <w:insideV w:val="single" w:sz="6" w:space="0" w:color="D9D9D9"/>
-            </w:tcBorders>
-            <w:tcMar>
-              <w:top w:w="110" w:type="dxa"/>
-              <w:start w:w="140" w:type="dxa"/>
-              <w:bottom w:w="140" w:type="dxa"/>
-              <w:end w:w="140" w:type="dxa"/>
-            </w:tcMar>
-            <w:vAlign w:val="center"/>
-          </w:tcPr>
-          <w:p>
-            <w:r>
-              <w:rPr>
-                <w:rFonts w:ascii="Aptos" w:hAnsi="Aptos"/>
+                <w:rFonts w:ascii="Arial" w:hAnsi="Arial" w:eastAsia="Arial"/>
                 <w:b/>
                 <w:color w:val="1F1F1F"/>
                 <w:sz w:val="19"/>
@@ -337,11 +486,14 @@
               <w:t>Lugar general de la prueba</w:t>
             </w:r>
             <w:r>
+              <w:rPr>
+                <w:rFonts w:ascii="Arial" w:hAnsi="Arial" w:eastAsia="Arial"/>
+              </w:rPr>
               <w:br/>
             </w:r>
             <w:r>
               <w:rPr>
-                <w:rFonts w:ascii="Aptos" w:hAnsi="Aptos"/>
+                <w:rFonts w:ascii="Arial" w:hAnsi="Arial" w:eastAsia="Arial"/>
                 <w:b w:val="0"/>
                 <w:color w:val="1F1F1F"/>
                 <w:sz w:val="21"/>
@@ -359,7 +511,7 @@
       </w:pPr>
       <w:r>
         <w:rPr>
-          <w:rFonts w:ascii="Aptos" w:hAnsi="Aptos"/>
+          <w:rFonts w:ascii="Arial" w:hAnsi="Arial" w:eastAsia="Arial"/>
           <w:b/>
           <w:color w:val="1F1F1F"/>
           <w:sz w:val="30"/>
@@ -373,12 +525,9 @@
       </w:pPr>
       <w:r>
         <w:rPr>
-          <w:rFonts w:ascii="Aptos" w:hAnsi="Aptos"/>
-          <w:b w:val="0"/>
-          <w:color w:val="1F1F1F"/>
-          <w:sz w:val="21"/>
+          <w:rFonts w:ascii="Arial" w:hAnsi="Arial" w:eastAsia="Arial"/>
         </w:rPr>
-        <w:t>Leer antes de comenzar: Esta prueba forma parte de un proyecto académico de Diseño. Se evaluará el funcionamiento de Relevo y no tu desempeño personal. Puedes detener la prueba o evitar cualquier pregunta. Tus respuestas serán utilizadas de manera anónima y únicamente con fines académicos.</w:t>
+        <w:t>Antes de comenzar, lee lo siguiente: Esta prueba forma parte de un proyecto académico de Diseño. Estamos probando Relevo, no tu desempeño. Puedes detenerte cuando quieras o dejar una pregunta sin responder. La información se registrará de forma anónima y se utilizará únicamente con fines académicos.</w:t>
       </w:r>
     </w:p>
     <w:tbl>
@@ -417,7 +566,7 @@
             </w:pPr>
             <w:r>
               <w:rPr>
-                <w:rFonts w:ascii="Aptos" w:hAnsi="Aptos"/>
+                <w:rFonts w:ascii="Arial" w:hAnsi="Arial" w:eastAsia="Arial"/>
                 <w:b w:val="0"/>
                 <w:color w:val="1F1F1F"/>
                 <w:sz w:val="21"/>
@@ -453,7 +602,7 @@
             </w:pPr>
             <w:r>
               <w:rPr>
-                <w:rFonts w:ascii="Aptos" w:hAnsi="Aptos"/>
+                <w:rFonts w:ascii="Arial" w:hAnsi="Arial" w:eastAsia="Arial"/>
                 <w:b w:val="0"/>
                 <w:color w:val="1F1F1F"/>
                 <w:sz w:val="21"/>
@@ -489,7 +638,7 @@
             </w:pPr>
             <w:r>
               <w:rPr>
-                <w:rFonts w:ascii="Aptos" w:hAnsi="Aptos"/>
+                <w:rFonts w:ascii="Arial" w:hAnsi="Arial" w:eastAsia="Arial"/>
                 <w:b w:val="0"/>
                 <w:color w:val="1F1F1F"/>
                 <w:sz w:val="21"/>
@@ -506,7 +655,7 @@
       </w:pPr>
       <w:r>
         <w:rPr>
-          <w:rFonts w:ascii="Aptos" w:hAnsi="Aptos"/>
+          <w:rFonts w:ascii="Arial" w:hAnsi="Arial" w:eastAsia="Arial"/>
           <w:b/>
           <w:color w:val="1F1F1F"/>
           <w:sz w:val="21"/>
@@ -561,7 +710,7 @@
       </w:pPr>
       <w:r>
         <w:rPr>
-          <w:rFonts w:ascii="Aptos" w:hAnsi="Aptos"/>
+          <w:rFonts w:ascii="Arial" w:hAnsi="Arial" w:eastAsia="Arial"/>
           <w:b/>
           <w:color w:val="1F1F1F"/>
           <w:sz w:val="30"/>
@@ -606,7 +755,7 @@
             </w:pPr>
             <w:r>
               <w:rPr>
-                <w:rFonts w:ascii="Aptos" w:hAnsi="Aptos"/>
+                <w:rFonts w:ascii="Arial" w:hAnsi="Arial" w:eastAsia="Arial"/>
                 <w:b w:val="0"/>
                 <w:color w:val="1F1F1F"/>
                 <w:sz w:val="21"/>
@@ -640,12 +789,9 @@
             </w:pPr>
             <w:r>
               <w:rPr>
-                <w:rFonts w:ascii="Aptos" w:hAnsi="Aptos"/>
-                <w:b w:val="0"/>
-                <w:color w:val="1F1F1F"/>
-                <w:sz w:val="21"/>
+                <w:rFonts w:ascii="Arial" w:hAnsi="Arial" w:eastAsia="Arial"/>
               </w:rPr>
-              <w:t>[ ] Teléfono de la participante</w:t>
+              <w:t>[ ] Teléfono de la persona</w:t>
             </w:r>
           </w:p>
         </w:tc>
@@ -676,7 +822,7 @@
             </w:pPr>
             <w:r>
               <w:rPr>
-                <w:rFonts w:ascii="Aptos" w:hAnsi="Aptos"/>
+                <w:rFonts w:ascii="Arial" w:hAnsi="Arial" w:eastAsia="Arial"/>
                 <w:b w:val="0"/>
                 <w:color w:val="1F1F1F"/>
                 <w:sz w:val="21"/>
@@ -710,7 +856,7 @@
             </w:pPr>
             <w:r>
               <w:rPr>
-                <w:rFonts w:ascii="Aptos" w:hAnsi="Aptos"/>
+                <w:rFonts w:ascii="Arial" w:hAnsi="Arial" w:eastAsia="Arial"/>
                 <w:b w:val="0"/>
                 <w:color w:val="1F1F1F"/>
                 <w:sz w:val="21"/>
@@ -746,7 +892,7 @@
             </w:pPr>
             <w:r>
               <w:rPr>
-                <w:rFonts w:ascii="Aptos" w:hAnsi="Aptos"/>
+                <w:rFonts w:ascii="Arial" w:hAnsi="Arial" w:eastAsia="Arial"/>
                 <w:b w:val="0"/>
                 <w:color w:val="1F1F1F"/>
                 <w:sz w:val="21"/>
@@ -780,7 +926,7 @@
             </w:pPr>
             <w:r>
               <w:rPr>
-                <w:rFonts w:ascii="Aptos" w:hAnsi="Aptos"/>
+                <w:rFonts w:ascii="Arial" w:hAnsi="Arial" w:eastAsia="Arial"/>
                 <w:b w:val="0"/>
                 <w:color w:val="1F1F1F"/>
                 <w:sz w:val="21"/>
@@ -799,12 +945,9 @@
       </w:pPr>
       <w:r>
         <w:rPr>
-          <w:rFonts w:ascii="Aptos" w:hAnsi="Aptos"/>
-          <w:b/>
-          <w:color w:val="1F1F1F"/>
-          <w:sz w:val="30"/>
+          <w:rFonts w:ascii="Arial" w:hAnsi="Arial" w:eastAsia="Arial"/>
         </w:rPr>
-        <w:t>Preparación inicial</w:t>
+        <w:t>Conversación antes de comenzar</w:t>
       </w:r>
     </w:p>
     <w:p>
@@ -813,12 +956,9 @@
       </w:pPr>
       <w:r>
         <w:rPr>
-          <w:rFonts w:ascii="Aptos" w:hAnsi="Aptos"/>
-          <w:b w:val="0"/>
-          <w:color w:val="1F1F1F"/>
-          <w:sz w:val="21"/>
+          <w:rFonts w:ascii="Arial" w:hAnsi="Arial" w:eastAsia="Arial"/>
         </w:rPr>
-        <w:t>Realizar una conversación de aproximadamente quince minutos. La actividad debe ser elegida por la participante y formar parte de su rutina real.</w:t>
+        <w:t>Conversa con la persona durante unos quince minutos. Pídele que elija una actividad real de su rutina, que de verdad quiera comenzar durante los próximos dos días.</w:t>
       </w:r>
     </w:p>
     <w:p>
@@ -827,7 +967,7 @@
       </w:pPr>
       <w:r>
         <w:rPr>
-          <w:rFonts w:ascii="Aptos" w:hAnsi="Aptos"/>
+          <w:rFonts w:ascii="Arial" w:hAnsi="Arial" w:eastAsia="Arial"/>
           <w:b/>
           <w:color w:val="1F1F1F"/>
           <w:sz w:val="21"/>
@@ -881,7 +1021,7 @@
       </w:pPr>
       <w:r>
         <w:rPr>
-          <w:rFonts w:ascii="Aptos" w:hAnsi="Aptos"/>
+          <w:rFonts w:ascii="Arial" w:hAnsi="Arial" w:eastAsia="Arial"/>
           <w:b/>
           <w:color w:val="1F1F1F"/>
           <w:sz w:val="21"/>
@@ -935,7 +1075,7 @@
       </w:pPr>
       <w:r>
         <w:rPr>
-          <w:rFonts w:ascii="Aptos" w:hAnsi="Aptos"/>
+          <w:rFonts w:ascii="Arial" w:hAnsi="Arial" w:eastAsia="Arial"/>
           <w:b/>
           <w:color w:val="1F1F1F"/>
           <w:sz w:val="21"/>
@@ -989,7 +1129,7 @@
       </w:pPr>
       <w:r>
         <w:rPr>
-          <w:rFonts w:ascii="Aptos" w:hAnsi="Aptos"/>
+          <w:rFonts w:ascii="Arial" w:hAnsi="Arial" w:eastAsia="Arial"/>
           <w:b/>
           <w:color w:val="1F1F1F"/>
           <w:sz w:val="21"/>
@@ -1043,7 +1183,7 @@
       </w:pPr>
       <w:r>
         <w:rPr>
-          <w:rFonts w:ascii="Aptos" w:hAnsi="Aptos"/>
+          <w:rFonts w:ascii="Arial" w:hAnsi="Arial" w:eastAsia="Arial"/>
           <w:b/>
           <w:color w:val="1F1F1F"/>
           <w:sz w:val="21"/>
@@ -1097,7 +1237,7 @@
       </w:pPr>
       <w:r>
         <w:rPr>
-          <w:rFonts w:ascii="Aptos" w:hAnsi="Aptos"/>
+          <w:rFonts w:ascii="Arial" w:hAnsi="Arial" w:eastAsia="Arial"/>
           <w:b/>
           <w:color w:val="1F1F1F"/>
           <w:sz w:val="21"/>
@@ -1151,7 +1291,7 @@
       </w:pPr>
       <w:r>
         <w:rPr>
-          <w:rFonts w:ascii="Aptos" w:hAnsi="Aptos"/>
+          <w:rFonts w:ascii="Arial" w:hAnsi="Arial" w:eastAsia="Arial"/>
           <w:b/>
           <w:color w:val="1F1F1F"/>
           <w:sz w:val="21"/>
@@ -1206,7 +1346,7 @@
       </w:pPr>
       <w:r>
         <w:rPr>
-          <w:rFonts w:ascii="Aptos" w:hAnsi="Aptos"/>
+          <w:rFonts w:ascii="Arial" w:hAnsi="Arial" w:eastAsia="Arial"/>
           <w:b/>
           <w:color w:val="1F1F1F"/>
           <w:sz w:val="30"/>
@@ -1250,13 +1390,7 @@
               <w:spacing w:after="0"/>
             </w:pPr>
             <w:r>
-              <w:rPr>
-                <w:rFonts w:ascii="Aptos" w:hAnsi="Aptos"/>
-                <w:b w:val="0"/>
-                <w:color w:val="1F1F1F"/>
-                <w:sz w:val="21"/>
-              </w:rPr>
-              <w:t>[ ] La actividad fue elegida libremente</w:t>
+              <w:t>[ ] La actividad fue elegida por la persona</w:t>
             </w:r>
           </w:p>
         </w:tc>
@@ -1285,7 +1419,7 @@
             </w:pPr>
             <w:r>
               <w:rPr>
-                <w:rFonts w:ascii="Aptos" w:hAnsi="Aptos"/>
+                <w:rFonts w:ascii="Arial" w:hAnsi="Arial" w:eastAsia="Arial"/>
                 <w:b w:val="0"/>
                 <w:color w:val="1F1F1F"/>
                 <w:sz w:val="21"/>
@@ -1321,7 +1455,7 @@
             </w:pPr>
             <w:r>
               <w:rPr>
-                <w:rFonts w:ascii="Aptos" w:hAnsi="Aptos"/>
+                <w:rFonts w:ascii="Arial" w:hAnsi="Arial" w:eastAsia="Arial"/>
                 <w:b w:val="0"/>
                 <w:color w:val="1F1F1F"/>
                 <w:sz w:val="21"/>
@@ -1355,12 +1489,9 @@
             </w:pPr>
             <w:r>
               <w:rPr>
-                <w:rFonts w:ascii="Aptos" w:hAnsi="Aptos"/>
-                <w:b w:val="0"/>
-                <w:color w:val="1F1F1F"/>
-                <w:sz w:val="21"/>
+                <w:rFonts w:ascii="Arial" w:hAnsi="Arial" w:eastAsia="Arial"/>
               </w:rPr>
-              <w:t>[ ] La participante puede detener la prueba</w:t>
+              <w:t>[ ] La persona puede detener la prueba</w:t>
             </w:r>
           </w:p>
         </w:tc>
@@ -1374,12 +1505,9 @@
       </w:pPr>
       <w:r>
         <w:rPr>
-          <w:rFonts w:ascii="Aptos" w:hAnsi="Aptos"/>
-          <w:b/>
-          <w:color w:val="1F1F1F"/>
-          <w:sz w:val="30"/>
+          <w:rFonts w:ascii="Arial" w:hAnsi="Arial" w:eastAsia="Arial"/>
         </w:rPr>
-        <w:t>Día 1 Selección y configuración</w:t>
+        <w:t>Día 1 Configurar Relevo</w:t>
       </w:r>
     </w:p>
     <w:p>
@@ -1388,12 +1516,9 @@
       </w:pPr>
       <w:r>
         <w:rPr>
-          <w:rFonts w:ascii="Aptos" w:hAnsi="Aptos"/>
-          <w:b w:val="0"/>
-          <w:color w:val="1F1F1F"/>
-          <w:sz w:val="21"/>
+          <w:rFonts w:ascii="Arial" w:hAnsi="Arial" w:eastAsia="Arial"/>
         </w:rPr>
-        <w:t>El primer día examina la comprensión inicial. No se debe volver a recordar la actividad antes de que aparezca la señal.</w:t>
+        <w:t>Durante el primer día puedes acompañar la configuración y responder dudas. Después, evita volver a mencionar la actividad antes de que aparezca la señal.</w:t>
       </w:r>
     </w:p>
     <w:p>
@@ -1402,7 +1527,7 @@
       </w:pPr>
       <w:r>
         <w:rPr>
-          <w:rFonts w:ascii="Aptos" w:hAnsi="Aptos"/>
+          <w:rFonts w:ascii="Arial" w:hAnsi="Arial" w:eastAsia="Arial"/>
           <w:b/>
           <w:color w:val="1F1F1F"/>
           <w:sz w:val="21"/>
@@ -1455,13 +1580,7 @@
         <w:spacing w:before="80" w:after="60"/>
       </w:pPr>
       <w:r>
-        <w:rPr>
-          <w:rFonts w:ascii="Aptos" w:hAnsi="Aptos"/>
-          <w:b/>
-          <w:color w:val="1F1F1F"/>
-          <w:sz w:val="21"/>
-        </w:rPr>
-        <w:t>¿Por qué desea realizarla?</w:t>
+        <w:t>¿Por qué quieres realizarla?</w:t>
       </w:r>
     </w:p>
     <w:tbl>
@@ -1538,7 +1657,7 @@
           <w:p>
             <w:r>
               <w:rPr>
-                <w:rFonts w:ascii="Aptos" w:hAnsi="Aptos"/>
+                <w:rFonts w:ascii="Arial" w:hAnsi="Arial" w:eastAsia="Arial"/>
                 <w:b/>
                 <w:color w:val="1F1F1F"/>
                 <w:sz w:val="19"/>
@@ -1546,11 +1665,14 @@
               <w:t>Lugar donde debería comenzar</w:t>
             </w:r>
             <w:r>
+              <w:rPr>
+                <w:rFonts w:ascii="Arial" w:hAnsi="Arial" w:eastAsia="Arial"/>
+              </w:rPr>
               <w:br/>
             </w:r>
             <w:r>
               <w:rPr>
-                <w:rFonts w:ascii="Aptos" w:hAnsi="Aptos"/>
+                <w:rFonts w:ascii="Arial" w:hAnsi="Arial" w:eastAsia="Arial"/>
                 <w:b w:val="0"/>
                 <w:color w:val="1F1F1F"/>
                 <w:sz w:val="21"/>
@@ -1581,7 +1703,7 @@
           <w:p>
             <w:r>
               <w:rPr>
-                <w:rFonts w:ascii="Aptos" w:hAnsi="Aptos"/>
+                <w:rFonts w:ascii="Arial" w:hAnsi="Arial" w:eastAsia="Arial"/>
                 <w:b/>
                 <w:color w:val="1F1F1F"/>
                 <w:sz w:val="19"/>
@@ -1589,11 +1711,14 @@
               <w:t>Objeto relacionado</w:t>
             </w:r>
             <w:r>
+              <w:rPr>
+                <w:rFonts w:ascii="Arial" w:hAnsi="Arial" w:eastAsia="Arial"/>
+              </w:rPr>
               <w:br/>
             </w:r>
             <w:r>
               <w:rPr>
-                <w:rFonts w:ascii="Aptos" w:hAnsi="Aptos"/>
+                <w:rFonts w:ascii="Arial" w:hAnsi="Arial" w:eastAsia="Arial"/>
                 <w:b w:val="0"/>
                 <w:color w:val="1F1F1F"/>
                 <w:sz w:val="21"/>
@@ -1626,7 +1751,7 @@
           <w:p>
             <w:r>
               <w:rPr>
-                <w:rFonts w:ascii="Aptos" w:hAnsi="Aptos"/>
+                <w:rFonts w:ascii="Arial" w:hAnsi="Arial" w:eastAsia="Arial"/>
                 <w:b/>
                 <w:color w:val="1F1F1F"/>
                 <w:sz w:val="19"/>
@@ -1634,11 +1759,14 @@
               <w:t>Momento aproximado</w:t>
             </w:r>
             <w:r>
+              <w:rPr>
+                <w:rFonts w:ascii="Arial" w:hAnsi="Arial" w:eastAsia="Arial"/>
+              </w:rPr>
               <w:br/>
             </w:r>
             <w:r>
               <w:rPr>
-                <w:rFonts w:ascii="Aptos" w:hAnsi="Aptos"/>
+                <w:rFonts w:ascii="Arial" w:hAnsi="Arial" w:eastAsia="Arial"/>
                 <w:b w:val="0"/>
                 <w:color w:val="1F1F1F"/>
                 <w:sz w:val="21"/>
@@ -1669,7 +1797,7 @@
           <w:p>
             <w:r>
               <w:rPr>
-                <w:rFonts w:ascii="Aptos" w:hAnsi="Aptos"/>
+                <w:rFonts w:ascii="Arial" w:hAnsi="Arial" w:eastAsia="Arial"/>
                 <w:b/>
                 <w:color w:val="1F1F1F"/>
                 <w:sz w:val="19"/>
@@ -1677,11 +1805,14 @@
               <w:t>Tiempo programado antes de la señal</w:t>
             </w:r>
             <w:r>
+              <w:rPr>
+                <w:rFonts w:ascii="Arial" w:hAnsi="Arial" w:eastAsia="Arial"/>
+              </w:rPr>
               <w:br/>
             </w:r>
             <w:r>
               <w:rPr>
-                <w:rFonts w:ascii="Aptos" w:hAnsi="Aptos"/>
+                <w:rFonts w:ascii="Arial" w:hAnsi="Arial" w:eastAsia="Arial"/>
                 <w:b w:val="0"/>
                 <w:color w:val="1F1F1F"/>
                 <w:sz w:val="21"/>
@@ -1698,7 +1829,7 @@
       </w:pPr>
       <w:r>
         <w:rPr>
-          <w:rFonts w:ascii="Aptos" w:hAnsi="Aptos"/>
+          <w:rFonts w:ascii="Arial" w:hAnsi="Arial" w:eastAsia="Arial"/>
           <w:b/>
           <w:color w:val="1F1F1F"/>
           <w:sz w:val="21"/>
@@ -1707,7 +1838,7 @@
       </w:r>
       <w:r>
         <w:rPr>
-          <w:rFonts w:ascii="Aptos" w:hAnsi="Aptos"/>
+          <w:rFonts w:ascii="Arial" w:hAnsi="Arial" w:eastAsia="Arial"/>
           <w:b w:val="0"/>
           <w:color w:val="666666"/>
           <w:sz w:val="18"/>
@@ -1761,12 +1892,9 @@
       </w:pPr>
       <w:r>
         <w:rPr>
-          <w:rFonts w:ascii="Aptos" w:hAnsi="Aptos"/>
-          <w:b/>
-          <w:color w:val="1F1F1F"/>
-          <w:sz w:val="21"/>
+          <w:rFonts w:ascii="Arial" w:hAnsi="Arial" w:eastAsia="Arial"/>
         </w:rPr>
-        <w:t>¿Cómo explica la participante lo que hará Relevo?</w:t>
+        <w:t>¿Cómo explica la persona lo que hará Relevo?</w:t>
       </w:r>
     </w:p>
     <w:tbl>
@@ -1815,7 +1943,7 @@
       </w:pPr>
       <w:r>
         <w:rPr>
-          <w:rFonts w:ascii="Aptos" w:hAnsi="Aptos"/>
+          <w:rFonts w:ascii="Arial" w:hAnsi="Arial" w:eastAsia="Arial"/>
           <w:b/>
           <w:color w:val="1F1F1F"/>
           <w:sz w:val="21"/>
@@ -1843,7 +1971,7 @@
             <w:tcBorders>
               <w:top w:val="single" w:sz="6" w:space="0" w:color="D9D9D9"/>
               <w:left w:val="single" w:sz="6" w:space="0" w:color="D9D9D9"/>
-              <w:bottom w:val="single" w:sz="6" w:space="0" w:color="D9D9D9"/>
+              <w:bottom w:val="single" w:sz="10" w:space="0" w:color="B7B7B7"/>
               <w:right w:val="single" w:sz="6" w:space="0" w:color="D9D9D9"/>
               <w:insideH w:val="single" w:sz="6" w:space="0" w:color="D9D9D9"/>
               <w:insideV w:val="single" w:sz="6" w:space="0" w:color="D9D9D9"/>
@@ -1899,7 +2027,7 @@
             </w:pPr>
             <w:r>
               <w:rPr>
-                <w:rFonts w:ascii="Aptos" w:hAnsi="Aptos"/>
+                <w:rFonts w:ascii="Arial" w:hAnsi="Arial" w:eastAsia="Arial"/>
                 <w:b w:val="0"/>
                 <w:color w:val="1F1F1F"/>
                 <w:sz w:val="21"/>
@@ -1935,7 +2063,7 @@
             </w:pPr>
             <w:r>
               <w:rPr>
-                <w:rFonts w:ascii="Aptos" w:hAnsi="Aptos"/>
+                <w:rFonts w:ascii="Arial" w:hAnsi="Arial" w:eastAsia="Arial"/>
                 <w:b w:val="0"/>
                 <w:color w:val="1F1F1F"/>
                 <w:sz w:val="21"/>
@@ -1971,7 +2099,7 @@
             </w:pPr>
             <w:r>
               <w:rPr>
-                <w:rFonts w:ascii="Aptos" w:hAnsi="Aptos"/>
+                <w:rFonts w:ascii="Arial" w:hAnsi="Arial" w:eastAsia="Arial"/>
                 <w:b w:val="0"/>
                 <w:color w:val="1F1F1F"/>
                 <w:sz w:val="21"/>
@@ -2007,7 +2135,7 @@
             </w:pPr>
             <w:r>
               <w:rPr>
-                <w:rFonts w:ascii="Aptos" w:hAnsi="Aptos"/>
+                <w:rFonts w:ascii="Arial" w:hAnsi="Arial" w:eastAsia="Arial"/>
                 <w:b w:val="0"/>
                 <w:color w:val="1F1F1F"/>
                 <w:sz w:val="21"/>
@@ -2026,12 +2154,9 @@
       </w:pPr>
       <w:r>
         <w:rPr>
-          <w:rFonts w:ascii="Aptos" w:hAnsi="Aptos"/>
-          <w:b/>
-          <w:color w:val="1F1F1F"/>
-          <w:sz w:val="30"/>
+          <w:rFonts w:ascii="Arial" w:hAnsi="Arial" w:eastAsia="Arial"/>
         </w:rPr>
-        <w:t>Día 1 Observación de la activación</w:t>
+        <w:t>Día 1 Qué ocurrió cuando sonó</w:t>
       </w:r>
     </w:p>
     <w:p>
@@ -2040,12 +2165,9 @@
       </w:pPr>
       <w:r>
         <w:rPr>
-          <w:rFonts w:ascii="Aptos" w:hAnsi="Aptos"/>
-          <w:b w:val="0"/>
-          <w:color w:val="1F1F1F"/>
-          <w:sz w:val="21"/>
+          <w:rFonts w:ascii="Arial" w:hAnsi="Arial" w:eastAsia="Arial"/>
         </w:rPr>
-        <w:t>Observar sin intervenir. Si no ocurre ninguna acción, cerrar el registro diez minutos después de la señal.</w:t>
+        <w:t>Cuando suene, observa sin intervenir. Si la persona no hace nada, espera diez minutos y cierra el registro de esa activación.</w:t>
       </w:r>
     </w:p>
     <w:tbl>
@@ -2085,7 +2207,7 @@
           <w:p>
             <w:r>
               <w:rPr>
-                <w:rFonts w:ascii="Aptos" w:hAnsi="Aptos"/>
+                <w:rFonts w:ascii="Arial" w:hAnsi="Arial" w:eastAsia="Arial"/>
                 <w:b/>
                 <w:color w:val="FFFFFF"/>
                 <w:sz w:val="19"/>
@@ -2116,7 +2238,7 @@
           <w:p>
             <w:r>
               <w:rPr>
-                <w:rFonts w:ascii="Aptos" w:hAnsi="Aptos"/>
+                <w:rFonts w:ascii="Arial" w:hAnsi="Arial" w:eastAsia="Arial"/>
                 <w:b/>
                 <w:color w:val="FFFFFF"/>
                 <w:sz w:val="19"/>
@@ -2149,7 +2271,7 @@
           <w:p>
             <w:r>
               <w:rPr>
-                <w:rFonts w:ascii="Aptos" w:hAnsi="Aptos"/>
+                <w:rFonts w:ascii="Arial" w:hAnsi="Arial" w:eastAsia="Arial"/>
                 <w:b/>
                 <w:color w:val="1F1F1F"/>
                 <w:sz w:val="19"/>
@@ -2180,7 +2302,7 @@
           <w:p>
             <w:r>
               <w:rPr>
-                <w:rFonts w:ascii="Aptos" w:hAnsi="Aptos"/>
+                <w:rFonts w:ascii="Arial" w:hAnsi="Arial" w:eastAsia="Arial"/>
                 <w:b w:val="0"/>
                 <w:color w:val="1F1F1F"/>
                 <w:sz w:val="19"/>
@@ -2213,7 +2335,7 @@
           <w:p>
             <w:r>
               <w:rPr>
-                <w:rFonts w:ascii="Aptos" w:hAnsi="Aptos"/>
+                <w:rFonts w:ascii="Arial" w:hAnsi="Arial" w:eastAsia="Arial"/>
                 <w:b/>
                 <w:color w:val="1F1F1F"/>
                 <w:sz w:val="19"/>
@@ -2245,7 +2367,7 @@
           <w:p>
             <w:r>
               <w:rPr>
-                <w:rFonts w:ascii="Aptos" w:hAnsi="Aptos"/>
+                <w:rFonts w:ascii="Arial" w:hAnsi="Arial" w:eastAsia="Arial"/>
                 <w:b w:val="0"/>
                 <w:color w:val="1F1F1F"/>
                 <w:sz w:val="19"/>
@@ -2277,7 +2399,7 @@
           <w:p>
             <w:r>
               <w:rPr>
-                <w:rFonts w:ascii="Aptos" w:hAnsi="Aptos"/>
+                <w:rFonts w:ascii="Arial" w:hAnsi="Arial" w:eastAsia="Arial"/>
                 <w:b/>
                 <w:color w:val="1F1F1F"/>
                 <w:sz w:val="19"/>
@@ -2308,7 +2430,7 @@
           <w:p>
             <w:r>
               <w:rPr>
-                <w:rFonts w:ascii="Aptos" w:hAnsi="Aptos"/>
+                <w:rFonts w:ascii="Arial" w:hAnsi="Arial" w:eastAsia="Arial"/>
                 <w:b w:val="0"/>
                 <w:color w:val="1F1F1F"/>
                 <w:sz w:val="19"/>
@@ -2342,7 +2464,7 @@
           <w:p>
             <w:r>
               <w:rPr>
-                <w:rFonts w:ascii="Aptos" w:hAnsi="Aptos"/>
+                <w:rFonts w:ascii="Arial" w:hAnsi="Arial" w:eastAsia="Arial"/>
                 <w:b/>
                 <w:color w:val="1F1F1F"/>
                 <w:sz w:val="19"/>
@@ -2374,7 +2496,7 @@
           <w:p>
             <w:r>
               <w:rPr>
-                <w:rFonts w:ascii="Aptos" w:hAnsi="Aptos"/>
+                <w:rFonts w:ascii="Arial" w:hAnsi="Arial" w:eastAsia="Arial"/>
                 <w:b w:val="0"/>
                 <w:color w:val="1F1F1F"/>
                 <w:sz w:val="19"/>
@@ -2407,7 +2529,7 @@
           <w:p>
             <w:r>
               <w:rPr>
-                <w:rFonts w:ascii="Aptos" w:hAnsi="Aptos"/>
+                <w:rFonts w:ascii="Arial" w:hAnsi="Arial" w:eastAsia="Arial"/>
                 <w:b/>
                 <w:color w:val="1F1F1F"/>
                 <w:sz w:val="19"/>
@@ -2438,7 +2560,7 @@
           <w:p>
             <w:r>
               <w:rPr>
-                <w:rFonts w:ascii="Aptos" w:hAnsi="Aptos"/>
+                <w:rFonts w:ascii="Arial" w:hAnsi="Arial" w:eastAsia="Arial"/>
                 <w:b w:val="0"/>
                 <w:color w:val="1F1F1F"/>
                 <w:sz w:val="19"/>
@@ -2472,7 +2594,7 @@
           <w:p>
             <w:r>
               <w:rPr>
-                <w:rFonts w:ascii="Aptos" w:hAnsi="Aptos"/>
+                <w:rFonts w:ascii="Arial" w:hAnsi="Arial" w:eastAsia="Arial"/>
                 <w:b/>
                 <w:color w:val="1F1F1F"/>
                 <w:sz w:val="19"/>
@@ -2504,7 +2626,7 @@
           <w:p>
             <w:r>
               <w:rPr>
-                <w:rFonts w:ascii="Aptos" w:hAnsi="Aptos"/>
+                <w:rFonts w:ascii="Arial" w:hAnsi="Arial" w:eastAsia="Arial"/>
                 <w:b w:val="0"/>
                 <w:color w:val="1F1F1F"/>
                 <w:sz w:val="19"/>
@@ -2537,7 +2659,7 @@
           <w:p>
             <w:r>
               <w:rPr>
-                <w:rFonts w:ascii="Aptos" w:hAnsi="Aptos"/>
+                <w:rFonts w:ascii="Arial" w:hAnsi="Arial" w:eastAsia="Arial"/>
                 <w:b/>
                 <w:color w:val="1F1F1F"/>
                 <w:sz w:val="19"/>
@@ -2568,7 +2690,7 @@
           <w:p>
             <w:r>
               <w:rPr>
-                <w:rFonts w:ascii="Aptos" w:hAnsi="Aptos"/>
+                <w:rFonts w:ascii="Arial" w:hAnsi="Arial" w:eastAsia="Arial"/>
                 <w:b w:val="0"/>
                 <w:color w:val="1F1F1F"/>
                 <w:sz w:val="19"/>
@@ -2602,7 +2724,7 @@
           <w:p>
             <w:r>
               <w:rPr>
-                <w:rFonts w:ascii="Aptos" w:hAnsi="Aptos"/>
+                <w:rFonts w:ascii="Arial" w:hAnsi="Arial" w:eastAsia="Arial"/>
                 <w:b/>
                 <w:color w:val="1F1F1F"/>
                 <w:sz w:val="19"/>
@@ -2634,7 +2756,7 @@
           <w:p>
             <w:r>
               <w:rPr>
-                <w:rFonts w:ascii="Aptos" w:hAnsi="Aptos"/>
+                <w:rFonts w:ascii="Arial" w:hAnsi="Arial" w:eastAsia="Arial"/>
                 <w:b w:val="0"/>
                 <w:color w:val="1F1F1F"/>
                 <w:sz w:val="19"/>
@@ -2666,7 +2788,7 @@
           <w:p>
             <w:r>
               <w:rPr>
-                <w:rFonts w:ascii="Aptos" w:hAnsi="Aptos"/>
+                <w:rFonts w:ascii="Arial" w:hAnsi="Arial" w:eastAsia="Arial"/>
                 <w:b/>
                 <w:color w:val="1F1F1F"/>
                 <w:sz w:val="19"/>
@@ -2697,7 +2819,7 @@
           <w:p>
             <w:r>
               <w:rPr>
-                <w:rFonts w:ascii="Aptos" w:hAnsi="Aptos"/>
+                <w:rFonts w:ascii="Arial" w:hAnsi="Arial" w:eastAsia="Arial"/>
                 <w:b w:val="0"/>
                 <w:color w:val="1F1F1F"/>
                 <w:sz w:val="19"/>
@@ -2713,7 +2835,7 @@
       </w:pPr>
       <w:r>
         <w:rPr>
-          <w:rFonts w:ascii="Aptos" w:hAnsi="Aptos"/>
+          <w:rFonts w:ascii="Arial" w:hAnsi="Arial" w:eastAsia="Arial"/>
           <w:b/>
           <w:color w:val="1F1F1F"/>
           <w:sz w:val="21"/>
@@ -2767,7 +2889,7 @@
       </w:pPr>
       <w:r>
         <w:rPr>
-          <w:rFonts w:ascii="Aptos" w:hAnsi="Aptos"/>
+          <w:rFonts w:ascii="Arial" w:hAnsi="Arial" w:eastAsia="Arial"/>
           <w:b/>
           <w:color w:val="1F1F1F"/>
           <w:sz w:val="21"/>
@@ -2821,7 +2943,7 @@
       </w:pPr>
       <w:r>
         <w:rPr>
-          <w:rFonts w:ascii="Aptos" w:hAnsi="Aptos"/>
+          <w:rFonts w:ascii="Arial" w:hAnsi="Arial" w:eastAsia="Arial"/>
           <w:b/>
           <w:color w:val="1F1F1F"/>
           <w:sz w:val="21"/>
@@ -2877,12 +2999,9 @@
       </w:pPr>
       <w:r>
         <w:rPr>
-          <w:rFonts w:ascii="Aptos" w:hAnsi="Aptos"/>
-          <w:b/>
-          <w:color w:val="1F1F1F"/>
-          <w:sz w:val="30"/>
+          <w:rFonts w:ascii="Arial" w:hAnsi="Arial" w:eastAsia="Arial"/>
         </w:rPr>
-        <w:t>Día 1 Evaluación inmediata</w:t>
+        <w:t>Día 1 Evaluación breve</w:t>
       </w:r>
     </w:p>
     <w:p>
@@ -2890,13 +3009,7 @@
         <w:spacing w:after="120"/>
       </w:pPr>
       <w:r>
-        <w:rPr>
-          <w:rFonts w:ascii="Aptos" w:hAnsi="Aptos"/>
-          <w:b w:val="0"/>
-          <w:color w:val="1F1F1F"/>
-          <w:sz w:val="21"/>
-        </w:rPr>
-        <w:t>Marcar una respuesta por afirmación. 1 significa totalmente en desacuerdo y 5 totalmente de acuerdo.</w:t>
+        <w:t>Marca una respuesta por afirmación. 1 significa totalmente en desacuerdo y 5 totalmente de acuerdo.</w:t>
       </w:r>
     </w:p>
     <w:tbl>
@@ -2944,7 +3057,7 @@
             </w:pPr>
             <w:r>
               <w:rPr>
-                <w:rFonts w:ascii="Aptos" w:hAnsi="Aptos"/>
+                <w:rFonts w:ascii="Arial" w:hAnsi="Arial" w:eastAsia="Arial"/>
                 <w:b/>
                 <w:color w:val="FFFFFF"/>
                 <w:sz w:val="18"/>
@@ -2979,7 +3092,7 @@
             </w:pPr>
             <w:r>
               <w:rPr>
-                <w:rFonts w:ascii="Aptos" w:hAnsi="Aptos"/>
+                <w:rFonts w:ascii="Arial" w:hAnsi="Arial" w:eastAsia="Arial"/>
                 <w:b/>
                 <w:color w:val="FFFFFF"/>
                 <w:sz w:val="18"/>
@@ -3014,7 +3127,7 @@
             </w:pPr>
             <w:r>
               <w:rPr>
-                <w:rFonts w:ascii="Aptos" w:hAnsi="Aptos"/>
+                <w:rFonts w:ascii="Arial" w:hAnsi="Arial" w:eastAsia="Arial"/>
                 <w:b/>
                 <w:color w:val="FFFFFF"/>
                 <w:sz w:val="18"/>
@@ -3049,7 +3162,7 @@
             </w:pPr>
             <w:r>
               <w:rPr>
-                <w:rFonts w:ascii="Aptos" w:hAnsi="Aptos"/>
+                <w:rFonts w:ascii="Arial" w:hAnsi="Arial" w:eastAsia="Arial"/>
                 <w:b/>
                 <w:color w:val="FFFFFF"/>
                 <w:sz w:val="18"/>
@@ -3084,7 +3197,7 @@
             </w:pPr>
             <w:r>
               <w:rPr>
-                <w:rFonts w:ascii="Aptos" w:hAnsi="Aptos"/>
+                <w:rFonts w:ascii="Arial" w:hAnsi="Arial" w:eastAsia="Arial"/>
                 <w:b/>
                 <w:color w:val="FFFFFF"/>
                 <w:sz w:val="18"/>
@@ -3119,7 +3232,7 @@
             </w:pPr>
             <w:r>
               <w:rPr>
-                <w:rFonts w:ascii="Aptos" w:hAnsi="Aptos"/>
+                <w:rFonts w:ascii="Arial" w:hAnsi="Arial" w:eastAsia="Arial"/>
                 <w:b/>
                 <w:color w:val="FFFFFF"/>
                 <w:sz w:val="18"/>
@@ -3155,7 +3268,7 @@
             </w:pPr>
             <w:r>
               <w:rPr>
-                <w:rFonts w:ascii="Aptos" w:hAnsi="Aptos"/>
+                <w:rFonts w:ascii="Arial" w:hAnsi="Arial" w:eastAsia="Arial"/>
                 <w:b w:val="0"/>
                 <w:color w:val="1F1F1F"/>
                 <w:sz w:val="18"/>
@@ -3189,7 +3302,7 @@
             </w:pPr>
             <w:r>
               <w:rPr>
-                <w:rFonts w:ascii="Aptos" w:hAnsi="Aptos"/>
+                <w:rFonts w:ascii="Arial" w:hAnsi="Arial" w:eastAsia="Arial"/>
                 <w:b w:val="0"/>
                 <w:color w:val="1F1F1F"/>
                 <w:sz w:val="18"/>
@@ -3223,7 +3336,7 @@
             </w:pPr>
             <w:r>
               <w:rPr>
-                <w:rFonts w:ascii="Aptos" w:hAnsi="Aptos"/>
+                <w:rFonts w:ascii="Arial" w:hAnsi="Arial" w:eastAsia="Arial"/>
                 <w:b w:val="0"/>
                 <w:color w:val="1F1F1F"/>
                 <w:sz w:val="18"/>
@@ -3257,7 +3370,7 @@
             </w:pPr>
             <w:r>
               <w:rPr>
-                <w:rFonts w:ascii="Aptos" w:hAnsi="Aptos"/>
+                <w:rFonts w:ascii="Arial" w:hAnsi="Arial" w:eastAsia="Arial"/>
                 <w:b w:val="0"/>
                 <w:color w:val="1F1F1F"/>
                 <w:sz w:val="18"/>
@@ -3291,7 +3404,7 @@
             </w:pPr>
             <w:r>
               <w:rPr>
-                <w:rFonts w:ascii="Aptos" w:hAnsi="Aptos"/>
+                <w:rFonts w:ascii="Arial" w:hAnsi="Arial" w:eastAsia="Arial"/>
                 <w:b w:val="0"/>
                 <w:color w:val="1F1F1F"/>
                 <w:sz w:val="18"/>
@@ -3325,7 +3438,7 @@
             </w:pPr>
             <w:r>
               <w:rPr>
-                <w:rFonts w:ascii="Aptos" w:hAnsi="Aptos"/>
+                <w:rFonts w:ascii="Arial" w:hAnsi="Arial" w:eastAsia="Arial"/>
                 <w:b w:val="0"/>
                 <w:color w:val="1F1F1F"/>
                 <w:sz w:val="18"/>
@@ -3362,7 +3475,7 @@
             </w:pPr>
             <w:r>
               <w:rPr>
-                <w:rFonts w:ascii="Aptos" w:hAnsi="Aptos"/>
+                <w:rFonts w:ascii="Arial" w:hAnsi="Arial" w:eastAsia="Arial"/>
                 <w:b w:val="0"/>
                 <w:color w:val="1F1F1F"/>
                 <w:sz w:val="18"/>
@@ -3397,7 +3510,7 @@
             </w:pPr>
             <w:r>
               <w:rPr>
-                <w:rFonts w:ascii="Aptos" w:hAnsi="Aptos"/>
+                <w:rFonts w:ascii="Arial" w:hAnsi="Arial" w:eastAsia="Arial"/>
                 <w:b w:val="0"/>
                 <w:color w:val="1F1F1F"/>
                 <w:sz w:val="18"/>
@@ -3432,7 +3545,7 @@
             </w:pPr>
             <w:r>
               <w:rPr>
-                <w:rFonts w:ascii="Aptos" w:hAnsi="Aptos"/>
+                <w:rFonts w:ascii="Arial" w:hAnsi="Arial" w:eastAsia="Arial"/>
                 <w:b w:val="0"/>
                 <w:color w:val="1F1F1F"/>
                 <w:sz w:val="18"/>
@@ -3467,7 +3580,7 @@
             </w:pPr>
             <w:r>
               <w:rPr>
-                <w:rFonts w:ascii="Aptos" w:hAnsi="Aptos"/>
+                <w:rFonts w:ascii="Arial" w:hAnsi="Arial" w:eastAsia="Arial"/>
                 <w:b w:val="0"/>
                 <w:color w:val="1F1F1F"/>
                 <w:sz w:val="18"/>
@@ -3502,7 +3615,7 @@
             </w:pPr>
             <w:r>
               <w:rPr>
-                <w:rFonts w:ascii="Aptos" w:hAnsi="Aptos"/>
+                <w:rFonts w:ascii="Arial" w:hAnsi="Arial" w:eastAsia="Arial"/>
                 <w:b w:val="0"/>
                 <w:color w:val="1F1F1F"/>
                 <w:sz w:val="18"/>
@@ -3537,7 +3650,7 @@
             </w:pPr>
             <w:r>
               <w:rPr>
-                <w:rFonts w:ascii="Aptos" w:hAnsi="Aptos"/>
+                <w:rFonts w:ascii="Arial" w:hAnsi="Arial" w:eastAsia="Arial"/>
                 <w:b w:val="0"/>
                 <w:color w:val="1F1F1F"/>
                 <w:sz w:val="18"/>
@@ -3573,7 +3686,7 @@
             </w:pPr>
             <w:r>
               <w:rPr>
-                <w:rFonts w:ascii="Aptos" w:hAnsi="Aptos"/>
+                <w:rFonts w:ascii="Arial" w:hAnsi="Arial" w:eastAsia="Arial"/>
                 <w:b w:val="0"/>
                 <w:color w:val="1F1F1F"/>
                 <w:sz w:val="18"/>
@@ -3607,7 +3720,7 @@
             </w:pPr>
             <w:r>
               <w:rPr>
-                <w:rFonts w:ascii="Aptos" w:hAnsi="Aptos"/>
+                <w:rFonts w:ascii="Arial" w:hAnsi="Arial" w:eastAsia="Arial"/>
                 <w:b w:val="0"/>
                 <w:color w:val="1F1F1F"/>
                 <w:sz w:val="18"/>
@@ -3641,7 +3754,7 @@
             </w:pPr>
             <w:r>
               <w:rPr>
-                <w:rFonts w:ascii="Aptos" w:hAnsi="Aptos"/>
+                <w:rFonts w:ascii="Arial" w:hAnsi="Arial" w:eastAsia="Arial"/>
                 <w:b w:val="0"/>
                 <w:color w:val="1F1F1F"/>
                 <w:sz w:val="18"/>
@@ -3675,7 +3788,7 @@
             </w:pPr>
             <w:r>
               <w:rPr>
-                <w:rFonts w:ascii="Aptos" w:hAnsi="Aptos"/>
+                <w:rFonts w:ascii="Arial" w:hAnsi="Arial" w:eastAsia="Arial"/>
                 <w:b w:val="0"/>
                 <w:color w:val="1F1F1F"/>
                 <w:sz w:val="18"/>
@@ -3709,7 +3822,7 @@
             </w:pPr>
             <w:r>
               <w:rPr>
-                <w:rFonts w:ascii="Aptos" w:hAnsi="Aptos"/>
+                <w:rFonts w:ascii="Arial" w:hAnsi="Arial" w:eastAsia="Arial"/>
                 <w:b w:val="0"/>
                 <w:color w:val="1F1F1F"/>
                 <w:sz w:val="18"/>
@@ -3743,7 +3856,7 @@
             </w:pPr>
             <w:r>
               <w:rPr>
-                <w:rFonts w:ascii="Aptos" w:hAnsi="Aptos"/>
+                <w:rFonts w:ascii="Arial" w:hAnsi="Arial" w:eastAsia="Arial"/>
                 <w:b w:val="0"/>
                 <w:color w:val="1F1F1F"/>
                 <w:sz w:val="18"/>
@@ -3780,7 +3893,7 @@
             </w:pPr>
             <w:r>
               <w:rPr>
-                <w:rFonts w:ascii="Aptos" w:hAnsi="Aptos"/>
+                <w:rFonts w:ascii="Arial" w:hAnsi="Arial" w:eastAsia="Arial"/>
                 <w:b w:val="0"/>
                 <w:color w:val="1F1F1F"/>
                 <w:sz w:val="18"/>
@@ -3815,7 +3928,7 @@
             </w:pPr>
             <w:r>
               <w:rPr>
-                <w:rFonts w:ascii="Aptos" w:hAnsi="Aptos"/>
+                <w:rFonts w:ascii="Arial" w:hAnsi="Arial" w:eastAsia="Arial"/>
                 <w:b w:val="0"/>
                 <w:color w:val="1F1F1F"/>
                 <w:sz w:val="18"/>
@@ -3850,7 +3963,7 @@
             </w:pPr>
             <w:r>
               <w:rPr>
-                <w:rFonts w:ascii="Aptos" w:hAnsi="Aptos"/>
+                <w:rFonts w:ascii="Arial" w:hAnsi="Arial" w:eastAsia="Arial"/>
                 <w:b w:val="0"/>
                 <w:color w:val="1F1F1F"/>
                 <w:sz w:val="18"/>
@@ -3885,7 +3998,7 @@
             </w:pPr>
             <w:r>
               <w:rPr>
-                <w:rFonts w:ascii="Aptos" w:hAnsi="Aptos"/>
+                <w:rFonts w:ascii="Arial" w:hAnsi="Arial" w:eastAsia="Arial"/>
                 <w:b w:val="0"/>
                 <w:color w:val="1F1F1F"/>
                 <w:sz w:val="18"/>
@@ -3920,7 +4033,7 @@
             </w:pPr>
             <w:r>
               <w:rPr>
-                <w:rFonts w:ascii="Aptos" w:hAnsi="Aptos"/>
+                <w:rFonts w:ascii="Arial" w:hAnsi="Arial" w:eastAsia="Arial"/>
                 <w:b w:val="0"/>
                 <w:color w:val="1F1F1F"/>
                 <w:sz w:val="18"/>
@@ -3955,7 +4068,7 @@
             </w:pPr>
             <w:r>
               <w:rPr>
-                <w:rFonts w:ascii="Aptos" w:hAnsi="Aptos"/>
+                <w:rFonts w:ascii="Arial" w:hAnsi="Arial" w:eastAsia="Arial"/>
                 <w:b w:val="0"/>
                 <w:color w:val="1F1F1F"/>
                 <w:sz w:val="18"/>
@@ -3991,7 +4104,7 @@
             </w:pPr>
             <w:r>
               <w:rPr>
-                <w:rFonts w:ascii="Aptos" w:hAnsi="Aptos"/>
+                <w:rFonts w:ascii="Arial" w:hAnsi="Arial" w:eastAsia="Arial"/>
                 <w:b w:val="0"/>
                 <w:color w:val="1F1F1F"/>
                 <w:sz w:val="18"/>
@@ -4025,7 +4138,7 @@
             </w:pPr>
             <w:r>
               <w:rPr>
-                <w:rFonts w:ascii="Aptos" w:hAnsi="Aptos"/>
+                <w:rFonts w:ascii="Arial" w:hAnsi="Arial" w:eastAsia="Arial"/>
                 <w:b w:val="0"/>
                 <w:color w:val="1F1F1F"/>
                 <w:sz w:val="18"/>
@@ -4059,7 +4172,7 @@
             </w:pPr>
             <w:r>
               <w:rPr>
-                <w:rFonts w:ascii="Aptos" w:hAnsi="Aptos"/>
+                <w:rFonts w:ascii="Arial" w:hAnsi="Arial" w:eastAsia="Arial"/>
                 <w:b w:val="0"/>
                 <w:color w:val="1F1F1F"/>
                 <w:sz w:val="18"/>
@@ -4093,7 +4206,7 @@
             </w:pPr>
             <w:r>
               <w:rPr>
-                <w:rFonts w:ascii="Aptos" w:hAnsi="Aptos"/>
+                <w:rFonts w:ascii="Arial" w:hAnsi="Arial" w:eastAsia="Arial"/>
                 <w:b w:val="0"/>
                 <w:color w:val="1F1F1F"/>
                 <w:sz w:val="18"/>
@@ -4127,7 +4240,7 @@
             </w:pPr>
             <w:r>
               <w:rPr>
-                <w:rFonts w:ascii="Aptos" w:hAnsi="Aptos"/>
+                <w:rFonts w:ascii="Arial" w:hAnsi="Arial" w:eastAsia="Arial"/>
                 <w:b w:val="0"/>
                 <w:color w:val="1F1F1F"/>
                 <w:sz w:val="18"/>
@@ -4161,7 +4274,7 @@
             </w:pPr>
             <w:r>
               <w:rPr>
-                <w:rFonts w:ascii="Aptos" w:hAnsi="Aptos"/>
+                <w:rFonts w:ascii="Arial" w:hAnsi="Arial" w:eastAsia="Arial"/>
                 <w:b w:val="0"/>
                 <w:color w:val="1F1F1F"/>
                 <w:sz w:val="18"/>
@@ -4198,7 +4311,7 @@
             </w:pPr>
             <w:r>
               <w:rPr>
-                <w:rFonts w:ascii="Aptos" w:hAnsi="Aptos"/>
+                <w:rFonts w:ascii="Arial" w:hAnsi="Arial" w:eastAsia="Arial"/>
                 <w:b w:val="0"/>
                 <w:color w:val="1F1F1F"/>
                 <w:sz w:val="18"/>
@@ -4233,7 +4346,7 @@
             </w:pPr>
             <w:r>
               <w:rPr>
-                <w:rFonts w:ascii="Aptos" w:hAnsi="Aptos"/>
+                <w:rFonts w:ascii="Arial" w:hAnsi="Arial" w:eastAsia="Arial"/>
                 <w:b w:val="0"/>
                 <w:color w:val="1F1F1F"/>
                 <w:sz w:val="18"/>
@@ -4268,7 +4381,7 @@
             </w:pPr>
             <w:r>
               <w:rPr>
-                <w:rFonts w:ascii="Aptos" w:hAnsi="Aptos"/>
+                <w:rFonts w:ascii="Arial" w:hAnsi="Arial" w:eastAsia="Arial"/>
                 <w:b w:val="0"/>
                 <w:color w:val="1F1F1F"/>
                 <w:sz w:val="18"/>
@@ -4303,7 +4416,7 @@
             </w:pPr>
             <w:r>
               <w:rPr>
-                <w:rFonts w:ascii="Aptos" w:hAnsi="Aptos"/>
+                <w:rFonts w:ascii="Arial" w:hAnsi="Arial" w:eastAsia="Arial"/>
                 <w:b w:val="0"/>
                 <w:color w:val="1F1F1F"/>
                 <w:sz w:val="18"/>
@@ -4338,7 +4451,7 @@
             </w:pPr>
             <w:r>
               <w:rPr>
-                <w:rFonts w:ascii="Aptos" w:hAnsi="Aptos"/>
+                <w:rFonts w:ascii="Arial" w:hAnsi="Arial" w:eastAsia="Arial"/>
                 <w:b w:val="0"/>
                 <w:color w:val="1F1F1F"/>
                 <w:sz w:val="18"/>
@@ -4373,7 +4486,7 @@
             </w:pPr>
             <w:r>
               <w:rPr>
-                <w:rFonts w:ascii="Aptos" w:hAnsi="Aptos"/>
+                <w:rFonts w:ascii="Arial" w:hAnsi="Arial" w:eastAsia="Arial"/>
                 <w:b w:val="0"/>
                 <w:color w:val="1F1F1F"/>
                 <w:sz w:val="18"/>
@@ -4409,7 +4522,7 @@
             </w:pPr>
             <w:r>
               <w:rPr>
-                <w:rFonts w:ascii="Aptos" w:hAnsi="Aptos"/>
+                <w:rFonts w:ascii="Arial" w:hAnsi="Arial" w:eastAsia="Arial"/>
                 <w:b w:val="0"/>
                 <w:color w:val="1F1F1F"/>
                 <w:sz w:val="18"/>
@@ -4443,7 +4556,7 @@
             </w:pPr>
             <w:r>
               <w:rPr>
-                <w:rFonts w:ascii="Aptos" w:hAnsi="Aptos"/>
+                <w:rFonts w:ascii="Arial" w:hAnsi="Arial" w:eastAsia="Arial"/>
                 <w:b w:val="0"/>
                 <w:color w:val="1F1F1F"/>
                 <w:sz w:val="18"/>
@@ -4477,7 +4590,7 @@
             </w:pPr>
             <w:r>
               <w:rPr>
-                <w:rFonts w:ascii="Aptos" w:hAnsi="Aptos"/>
+                <w:rFonts w:ascii="Arial" w:hAnsi="Arial" w:eastAsia="Arial"/>
                 <w:b w:val="0"/>
                 <w:color w:val="1F1F1F"/>
                 <w:sz w:val="18"/>
@@ -4511,7 +4624,7 @@
             </w:pPr>
             <w:r>
               <w:rPr>
-                <w:rFonts w:ascii="Aptos" w:hAnsi="Aptos"/>
+                <w:rFonts w:ascii="Arial" w:hAnsi="Arial" w:eastAsia="Arial"/>
                 <w:b w:val="0"/>
                 <w:color w:val="1F1F1F"/>
                 <w:sz w:val="18"/>
@@ -4545,7 +4658,7 @@
             </w:pPr>
             <w:r>
               <w:rPr>
-                <w:rFonts w:ascii="Aptos" w:hAnsi="Aptos"/>
+                <w:rFonts w:ascii="Arial" w:hAnsi="Arial" w:eastAsia="Arial"/>
                 <w:b w:val="0"/>
                 <w:color w:val="1F1F1F"/>
                 <w:sz w:val="18"/>
@@ -4579,7 +4692,7 @@
             </w:pPr>
             <w:r>
               <w:rPr>
-                <w:rFonts w:ascii="Aptos" w:hAnsi="Aptos"/>
+                <w:rFonts w:ascii="Arial" w:hAnsi="Arial" w:eastAsia="Arial"/>
                 <w:b w:val="0"/>
                 <w:color w:val="1F1F1F"/>
                 <w:sz w:val="18"/>
@@ -4616,7 +4729,7 @@
             </w:pPr>
             <w:r>
               <w:rPr>
-                <w:rFonts w:ascii="Aptos" w:hAnsi="Aptos"/>
+                <w:rFonts w:ascii="Arial" w:hAnsi="Arial" w:eastAsia="Arial"/>
                 <w:b w:val="0"/>
                 <w:color w:val="1F1F1F"/>
                 <w:sz w:val="18"/>
@@ -4651,7 +4764,7 @@
             </w:pPr>
             <w:r>
               <w:rPr>
-                <w:rFonts w:ascii="Aptos" w:hAnsi="Aptos"/>
+                <w:rFonts w:ascii="Arial" w:hAnsi="Arial" w:eastAsia="Arial"/>
                 <w:b w:val="0"/>
                 <w:color w:val="1F1F1F"/>
                 <w:sz w:val="18"/>
@@ -4686,7 +4799,7 @@
             </w:pPr>
             <w:r>
               <w:rPr>
-                <w:rFonts w:ascii="Aptos" w:hAnsi="Aptos"/>
+                <w:rFonts w:ascii="Arial" w:hAnsi="Arial" w:eastAsia="Arial"/>
                 <w:b w:val="0"/>
                 <w:color w:val="1F1F1F"/>
                 <w:sz w:val="18"/>
@@ -4721,7 +4834,7 @@
             </w:pPr>
             <w:r>
               <w:rPr>
-                <w:rFonts w:ascii="Aptos" w:hAnsi="Aptos"/>
+                <w:rFonts w:ascii="Arial" w:hAnsi="Arial" w:eastAsia="Arial"/>
                 <w:b w:val="0"/>
                 <w:color w:val="1F1F1F"/>
                 <w:sz w:val="18"/>
@@ -4756,7 +4869,7 @@
             </w:pPr>
             <w:r>
               <w:rPr>
-                <w:rFonts w:ascii="Aptos" w:hAnsi="Aptos"/>
+                <w:rFonts w:ascii="Arial" w:hAnsi="Arial" w:eastAsia="Arial"/>
                 <w:b w:val="0"/>
                 <w:color w:val="1F1F1F"/>
                 <w:sz w:val="18"/>
@@ -4791,7 +4904,7 @@
             </w:pPr>
             <w:r>
               <w:rPr>
-                <w:rFonts w:ascii="Aptos" w:hAnsi="Aptos"/>
+                <w:rFonts w:ascii="Arial" w:hAnsi="Arial" w:eastAsia="Arial"/>
                 <w:b w:val="0"/>
                 <w:color w:val="1F1F1F"/>
                 <w:sz w:val="18"/>
@@ -4810,12 +4923,9 @@
       </w:pPr>
       <w:r>
         <w:rPr>
-          <w:rFonts w:ascii="Aptos" w:hAnsi="Aptos"/>
-          <w:b/>
-          <w:color w:val="1F1F1F"/>
-          <w:sz w:val="30"/>
+          <w:rFonts w:ascii="Arial" w:hAnsi="Arial" w:eastAsia="Arial"/>
         </w:rPr>
-        <w:t>Día 1 Conversación posterior</w:t>
+        <w:t>Día 1 Conversación de cierre</w:t>
       </w:r>
     </w:p>
     <w:p>
@@ -4824,7 +4934,7 @@
       </w:pPr>
       <w:r>
         <w:rPr>
-          <w:rFonts w:ascii="Aptos" w:hAnsi="Aptos"/>
+          <w:rFonts w:ascii="Arial" w:hAnsi="Arial" w:eastAsia="Arial"/>
           <w:b/>
           <w:color w:val="1F1F1F"/>
           <w:sz w:val="21"/>
@@ -4878,7 +4988,7 @@
       </w:pPr>
       <w:r>
         <w:rPr>
-          <w:rFonts w:ascii="Aptos" w:hAnsi="Aptos"/>
+          <w:rFonts w:ascii="Arial" w:hAnsi="Arial" w:eastAsia="Arial"/>
           <w:b/>
           <w:color w:val="1F1F1F"/>
           <w:sz w:val="21"/>
@@ -4932,7 +5042,7 @@
       </w:pPr>
       <w:r>
         <w:rPr>
-          <w:rFonts w:ascii="Aptos" w:hAnsi="Aptos"/>
+          <w:rFonts w:ascii="Arial" w:hAnsi="Arial" w:eastAsia="Arial"/>
           <w:b/>
           <w:color w:val="1F1F1F"/>
           <w:sz w:val="21"/>
@@ -4986,7 +5096,7 @@
       </w:pPr>
       <w:r>
         <w:rPr>
-          <w:rFonts w:ascii="Aptos" w:hAnsi="Aptos"/>
+          <w:rFonts w:ascii="Arial" w:hAnsi="Arial" w:eastAsia="Arial"/>
           <w:b/>
           <w:color w:val="1F1F1F"/>
           <w:sz w:val="21"/>
@@ -5040,7 +5150,7 @@
       </w:pPr>
       <w:r>
         <w:rPr>
-          <w:rFonts w:ascii="Aptos" w:hAnsi="Aptos"/>
+          <w:rFonts w:ascii="Arial" w:hAnsi="Arial" w:eastAsia="Arial"/>
           <w:b/>
           <w:color w:val="1F1F1F"/>
           <w:sz w:val="21"/>
@@ -5095,7 +5205,7 @@
       </w:pPr>
       <w:r>
         <w:rPr>
-          <w:rFonts w:ascii="Aptos" w:hAnsi="Aptos"/>
+          <w:rFonts w:ascii="Arial" w:hAnsi="Arial" w:eastAsia="Arial"/>
           <w:b/>
           <w:color w:val="1F1F1F"/>
           <w:sz w:val="30"/>
@@ -5109,7 +5219,7 @@
       </w:pPr>
       <w:r>
         <w:rPr>
-          <w:rFonts w:ascii="Aptos" w:hAnsi="Aptos"/>
+          <w:rFonts w:ascii="Arial" w:hAnsi="Arial" w:eastAsia="Arial"/>
           <w:b/>
           <w:color w:val="1F1F1F"/>
           <w:sz w:val="21"/>
@@ -5163,7 +5273,7 @@
       </w:pPr>
       <w:r>
         <w:rPr>
-          <w:rFonts w:ascii="Aptos" w:hAnsi="Aptos"/>
+          <w:rFonts w:ascii="Arial" w:hAnsi="Arial" w:eastAsia="Arial"/>
           <w:b/>
           <w:color w:val="1F1F1F"/>
           <w:sz w:val="21"/>
@@ -5217,7 +5327,7 @@
       </w:pPr>
       <w:r>
         <w:rPr>
-          <w:rFonts w:ascii="Aptos" w:hAnsi="Aptos"/>
+          <w:rFonts w:ascii="Arial" w:hAnsi="Arial" w:eastAsia="Arial"/>
           <w:b/>
           <w:color w:val="1F1F1F"/>
           <w:sz w:val="21"/>
@@ -5226,7 +5336,7 @@
       </w:r>
       <w:r>
         <w:rPr>
-          <w:rFonts w:ascii="Aptos" w:hAnsi="Aptos"/>
+          <w:rFonts w:ascii="Arial" w:hAnsi="Arial" w:eastAsia="Arial"/>
           <w:b w:val="0"/>
           <w:color w:val="666666"/>
           <w:sz w:val="18"/>
@@ -5282,12 +5392,9 @@
       </w:pPr>
       <w:r>
         <w:rPr>
-          <w:rFonts w:ascii="Aptos" w:hAnsi="Aptos"/>
-          <w:b/>
-          <w:color w:val="1F1F1F"/>
-          <w:sz w:val="30"/>
+          <w:rFonts w:ascii="Arial" w:hAnsi="Arial" w:eastAsia="Arial"/>
         </w:rPr>
-        <w:t>Día 2 Configuración autónoma</w:t>
+        <w:t>Día 2 Configurar Relevo con poca ayuda</w:t>
       </w:r>
     </w:p>
     <w:p>
@@ -5296,12 +5403,9 @@
       </w:pPr>
       <w:r>
         <w:rPr>
-          <w:rFonts w:ascii="Aptos" w:hAnsi="Aptos"/>
-          <w:b w:val="0"/>
-          <w:color w:val="1F1F1F"/>
-          <w:sz w:val="21"/>
+          <w:rFonts w:ascii="Arial" w:hAnsi="Arial" w:eastAsia="Arial"/>
         </w:rPr>
-        <w:t>La participante elige una actividad distinta y configura la experiencia con la menor ayuda posible.</w:t>
+        <w:t>La persona elige una actividad distinta y configura Relevo con la menor ayuda posible. Registra cada ayuda que solicite o que resulte necesaria.</w:t>
       </w:r>
     </w:p>
     <w:p>
@@ -5310,7 +5414,7 @@
       </w:pPr>
       <w:r>
         <w:rPr>
-          <w:rFonts w:ascii="Aptos" w:hAnsi="Aptos"/>
+          <w:rFonts w:ascii="Arial" w:hAnsi="Arial" w:eastAsia="Arial"/>
           <w:b/>
           <w:color w:val="1F1F1F"/>
           <w:sz w:val="21"/>
@@ -5364,7 +5468,7 @@
       </w:pPr>
       <w:r>
         <w:rPr>
-          <w:rFonts w:ascii="Aptos" w:hAnsi="Aptos"/>
+          <w:rFonts w:ascii="Arial" w:hAnsi="Arial" w:eastAsia="Arial"/>
           <w:b/>
           <w:color w:val="1F1F1F"/>
           <w:sz w:val="21"/>
@@ -5446,7 +5550,7 @@
           <w:p>
             <w:r>
               <w:rPr>
-                <w:rFonts w:ascii="Aptos" w:hAnsi="Aptos"/>
+                <w:rFonts w:ascii="Arial" w:hAnsi="Arial" w:eastAsia="Arial"/>
                 <w:b/>
                 <w:color w:val="1F1F1F"/>
                 <w:sz w:val="19"/>
@@ -5454,11 +5558,14 @@
               <w:t>Objeto relacionado</w:t>
             </w:r>
             <w:r>
+              <w:rPr>
+                <w:rFonts w:ascii="Arial" w:hAnsi="Arial" w:eastAsia="Arial"/>
+              </w:rPr>
               <w:br/>
             </w:r>
             <w:r>
               <w:rPr>
-                <w:rFonts w:ascii="Aptos" w:hAnsi="Aptos"/>
+                <w:rFonts w:ascii="Arial" w:hAnsi="Arial" w:eastAsia="Arial"/>
                 <w:b w:val="0"/>
                 <w:color w:val="1F1F1F"/>
                 <w:sz w:val="21"/>
@@ -5489,7 +5596,7 @@
           <w:p>
             <w:r>
               <w:rPr>
-                <w:rFonts w:ascii="Aptos" w:hAnsi="Aptos"/>
+                <w:rFonts w:ascii="Arial" w:hAnsi="Arial" w:eastAsia="Arial"/>
                 <w:b/>
                 <w:color w:val="1F1F1F"/>
                 <w:sz w:val="19"/>
@@ -5497,11 +5604,14 @@
               <w:t>Ubicación del dispositivo</w:t>
             </w:r>
             <w:r>
+              <w:rPr>
+                <w:rFonts w:ascii="Arial" w:hAnsi="Arial" w:eastAsia="Arial"/>
+              </w:rPr>
               <w:br/>
             </w:r>
             <w:r>
               <w:rPr>
-                <w:rFonts w:ascii="Aptos" w:hAnsi="Aptos"/>
+                <w:rFonts w:ascii="Arial" w:hAnsi="Arial" w:eastAsia="Arial"/>
                 <w:b w:val="0"/>
                 <w:color w:val="1F1F1F"/>
                 <w:sz w:val="21"/>
@@ -5534,7 +5644,7 @@
           <w:p>
             <w:r>
               <w:rPr>
-                <w:rFonts w:ascii="Aptos" w:hAnsi="Aptos"/>
+                <w:rFonts w:ascii="Arial" w:hAnsi="Arial" w:eastAsia="Arial"/>
                 <w:b/>
                 <w:color w:val="1F1F1F"/>
                 <w:sz w:val="19"/>
@@ -5542,11 +5652,14 @@
               <w:t>Tiempo programado</w:t>
             </w:r>
             <w:r>
+              <w:rPr>
+                <w:rFonts w:ascii="Arial" w:hAnsi="Arial" w:eastAsia="Arial"/>
+              </w:rPr>
               <w:br/>
             </w:r>
             <w:r>
               <w:rPr>
-                <w:rFonts w:ascii="Aptos" w:hAnsi="Aptos"/>
+                <w:rFonts w:ascii="Arial" w:hAnsi="Arial" w:eastAsia="Arial"/>
                 <w:b w:val="0"/>
                 <w:color w:val="1F1F1F"/>
                 <w:sz w:val="21"/>
@@ -5577,7 +5690,7 @@
           <w:p>
             <w:r>
               <w:rPr>
-                <w:rFonts w:ascii="Aptos" w:hAnsi="Aptos"/>
+                <w:rFonts w:ascii="Arial" w:hAnsi="Arial" w:eastAsia="Arial"/>
                 <w:b/>
                 <w:color w:val="1F1F1F"/>
                 <w:sz w:val="19"/>
@@ -5585,11 +5698,14 @@
               <w:t>Tiempo de configuración</w:t>
             </w:r>
             <w:r>
+              <w:rPr>
+                <w:rFonts w:ascii="Arial" w:hAnsi="Arial" w:eastAsia="Arial"/>
+              </w:rPr>
               <w:br/>
             </w:r>
             <w:r>
               <w:rPr>
-                <w:rFonts w:ascii="Aptos" w:hAnsi="Aptos"/>
+                <w:rFonts w:ascii="Arial" w:hAnsi="Arial" w:eastAsia="Arial"/>
                 <w:b w:val="0"/>
                 <w:color w:val="1F1F1F"/>
                 <w:sz w:val="21"/>
@@ -5622,7 +5738,7 @@
           <w:p>
             <w:r>
               <w:rPr>
-                <w:rFonts w:ascii="Aptos" w:hAnsi="Aptos"/>
+                <w:rFonts w:ascii="Arial" w:hAnsi="Arial" w:eastAsia="Arial"/>
                 <w:b/>
                 <w:color w:val="1F1F1F"/>
                 <w:sz w:val="19"/>
@@ -5630,11 +5746,14 @@
               <w:t>Cantidad de ayudas solicitadas</w:t>
             </w:r>
             <w:r>
+              <w:rPr>
+                <w:rFonts w:ascii="Arial" w:hAnsi="Arial" w:eastAsia="Arial"/>
+              </w:rPr>
               <w:br/>
             </w:r>
             <w:r>
               <w:rPr>
-                <w:rFonts w:ascii="Aptos" w:hAnsi="Aptos"/>
+                <w:rFonts w:ascii="Arial" w:hAnsi="Arial" w:eastAsia="Arial"/>
                 <w:b w:val="0"/>
                 <w:color w:val="1F1F1F"/>
                 <w:sz w:val="21"/>
@@ -5665,7 +5784,7 @@
           <w:p>
             <w:r>
               <w:rPr>
-                <w:rFonts w:ascii="Aptos" w:hAnsi="Aptos"/>
+                <w:rFonts w:ascii="Arial" w:hAnsi="Arial" w:eastAsia="Arial"/>
                 <w:b/>
                 <w:color w:val="1F1F1F"/>
                 <w:sz w:val="19"/>
@@ -5673,11 +5792,14 @@
               <w:t>Cantidad de errores observados</w:t>
             </w:r>
             <w:r>
+              <w:rPr>
+                <w:rFonts w:ascii="Arial" w:hAnsi="Arial" w:eastAsia="Arial"/>
+              </w:rPr>
               <w:br/>
             </w:r>
             <w:r>
               <w:rPr>
-                <w:rFonts w:ascii="Aptos" w:hAnsi="Aptos"/>
+                <w:rFonts w:ascii="Arial" w:hAnsi="Arial" w:eastAsia="Arial"/>
                 <w:b w:val="0"/>
                 <w:color w:val="1F1F1F"/>
                 <w:sz w:val="21"/>
@@ -5694,7 +5816,7 @@
       </w:pPr>
       <w:r>
         <w:rPr>
-          <w:rFonts w:ascii="Aptos" w:hAnsi="Aptos"/>
+          <w:rFonts w:ascii="Arial" w:hAnsi="Arial" w:eastAsia="Arial"/>
           <w:b/>
           <w:color w:val="1F1F1F"/>
           <w:sz w:val="21"/>
@@ -5722,7 +5844,7 @@
             <w:tcBorders>
               <w:top w:val="single" w:sz="6" w:space="0" w:color="D9D9D9"/>
               <w:left w:val="single" w:sz="6" w:space="0" w:color="D9D9D9"/>
-              <w:bottom w:val="single" w:sz="6" w:space="0" w:color="D9D9D9"/>
+              <w:bottom w:val="single" w:sz="10" w:space="0" w:color="B7B7B7"/>
               <w:right w:val="single" w:sz="6" w:space="0" w:color="D9D9D9"/>
               <w:insideH w:val="single" w:sz="6" w:space="0" w:color="D9D9D9"/>
               <w:insideV w:val="single" w:sz="6" w:space="0" w:color="D9D9D9"/>
@@ -5778,7 +5900,7 @@
             </w:pPr>
             <w:r>
               <w:rPr>
-                <w:rFonts w:ascii="Aptos" w:hAnsi="Aptos"/>
+                <w:rFonts w:ascii="Arial" w:hAnsi="Arial" w:eastAsia="Arial"/>
                 <w:b w:val="0"/>
                 <w:color w:val="1F1F1F"/>
                 <w:sz w:val="21"/>
@@ -5814,7 +5936,7 @@
             </w:pPr>
             <w:r>
               <w:rPr>
-                <w:rFonts w:ascii="Aptos" w:hAnsi="Aptos"/>
+                <w:rFonts w:ascii="Arial" w:hAnsi="Arial" w:eastAsia="Arial"/>
                 <w:b w:val="0"/>
                 <w:color w:val="1F1F1F"/>
                 <w:sz w:val="21"/>
@@ -5850,7 +5972,7 @@
             </w:pPr>
             <w:r>
               <w:rPr>
-                <w:rFonts w:ascii="Aptos" w:hAnsi="Aptos"/>
+                <w:rFonts w:ascii="Arial" w:hAnsi="Arial" w:eastAsia="Arial"/>
                 <w:b w:val="0"/>
                 <w:color w:val="1F1F1F"/>
                 <w:sz w:val="21"/>
@@ -5886,7 +6008,7 @@
             </w:pPr>
             <w:r>
               <w:rPr>
-                <w:rFonts w:ascii="Aptos" w:hAnsi="Aptos"/>
+                <w:rFonts w:ascii="Arial" w:hAnsi="Arial" w:eastAsia="Arial"/>
                 <w:b w:val="0"/>
                 <w:color w:val="1F1F1F"/>
                 <w:sz w:val="21"/>
@@ -5905,12 +6027,9 @@
       </w:pPr>
       <w:r>
         <w:rPr>
-          <w:rFonts w:ascii="Aptos" w:hAnsi="Aptos"/>
-          <w:b/>
-          <w:color w:val="1F1F1F"/>
-          <w:sz w:val="30"/>
+          <w:rFonts w:ascii="Arial" w:hAnsi="Arial" w:eastAsia="Arial"/>
         </w:rPr>
-        <w:t>Día 2 Observación de la activación</w:t>
+        <w:t>Día 2 Qué ocurrió cuando sonó</w:t>
       </w:r>
     </w:p>
     <w:tbl>
@@ -5950,7 +6069,7 @@
           <w:p>
             <w:r>
               <w:rPr>
-                <w:rFonts w:ascii="Aptos" w:hAnsi="Aptos"/>
+                <w:rFonts w:ascii="Arial" w:hAnsi="Arial" w:eastAsia="Arial"/>
                 <w:b/>
                 <w:color w:val="FFFFFF"/>
                 <w:sz w:val="19"/>
@@ -5981,7 +6100,7 @@
           <w:p>
             <w:r>
               <w:rPr>
-                <w:rFonts w:ascii="Aptos" w:hAnsi="Aptos"/>
+                <w:rFonts w:ascii="Arial" w:hAnsi="Arial" w:eastAsia="Arial"/>
                 <w:b/>
                 <w:color w:val="FFFFFF"/>
                 <w:sz w:val="19"/>
@@ -6014,7 +6133,7 @@
           <w:p>
             <w:r>
               <w:rPr>
-                <w:rFonts w:ascii="Aptos" w:hAnsi="Aptos"/>
+                <w:rFonts w:ascii="Arial" w:hAnsi="Arial" w:eastAsia="Arial"/>
                 <w:b/>
                 <w:color w:val="1F1F1F"/>
                 <w:sz w:val="19"/>
@@ -6045,7 +6164,7 @@
           <w:p>
             <w:r>
               <w:rPr>
-                <w:rFonts w:ascii="Aptos" w:hAnsi="Aptos"/>
+                <w:rFonts w:ascii="Arial" w:hAnsi="Arial" w:eastAsia="Arial"/>
                 <w:b w:val="0"/>
                 <w:color w:val="1F1F1F"/>
                 <w:sz w:val="19"/>
@@ -6078,7 +6197,7 @@
           <w:p>
             <w:r>
               <w:rPr>
-                <w:rFonts w:ascii="Aptos" w:hAnsi="Aptos"/>
+                <w:rFonts w:ascii="Arial" w:hAnsi="Arial" w:eastAsia="Arial"/>
                 <w:b/>
                 <w:color w:val="1F1F1F"/>
                 <w:sz w:val="19"/>
@@ -6110,7 +6229,7 @@
           <w:p>
             <w:r>
               <w:rPr>
-                <w:rFonts w:ascii="Aptos" w:hAnsi="Aptos"/>
+                <w:rFonts w:ascii="Arial" w:hAnsi="Arial" w:eastAsia="Arial"/>
                 <w:b w:val="0"/>
                 <w:color w:val="1F1F1F"/>
                 <w:sz w:val="19"/>
@@ -6142,7 +6261,7 @@
           <w:p>
             <w:r>
               <w:rPr>
-                <w:rFonts w:ascii="Aptos" w:hAnsi="Aptos"/>
+                <w:rFonts w:ascii="Arial" w:hAnsi="Arial" w:eastAsia="Arial"/>
                 <w:b/>
                 <w:color w:val="1F1F1F"/>
                 <w:sz w:val="19"/>
@@ -6173,7 +6292,7 @@
           <w:p>
             <w:r>
               <w:rPr>
-                <w:rFonts w:ascii="Aptos" w:hAnsi="Aptos"/>
+                <w:rFonts w:ascii="Arial" w:hAnsi="Arial" w:eastAsia="Arial"/>
                 <w:b w:val="0"/>
                 <w:color w:val="1F1F1F"/>
                 <w:sz w:val="19"/>
@@ -6207,7 +6326,7 @@
           <w:p>
             <w:r>
               <w:rPr>
-                <w:rFonts w:ascii="Aptos" w:hAnsi="Aptos"/>
+                <w:rFonts w:ascii="Arial" w:hAnsi="Arial" w:eastAsia="Arial"/>
                 <w:b/>
                 <w:color w:val="1F1F1F"/>
                 <w:sz w:val="19"/>
@@ -6239,7 +6358,7 @@
           <w:p>
             <w:r>
               <w:rPr>
-                <w:rFonts w:ascii="Aptos" w:hAnsi="Aptos"/>
+                <w:rFonts w:ascii="Arial" w:hAnsi="Arial" w:eastAsia="Arial"/>
                 <w:b w:val="0"/>
                 <w:color w:val="1F1F1F"/>
                 <w:sz w:val="19"/>
@@ -6272,7 +6391,7 @@
           <w:p>
             <w:r>
               <w:rPr>
-                <w:rFonts w:ascii="Aptos" w:hAnsi="Aptos"/>
+                <w:rFonts w:ascii="Arial" w:hAnsi="Arial" w:eastAsia="Arial"/>
                 <w:b/>
                 <w:color w:val="1F1F1F"/>
                 <w:sz w:val="19"/>
@@ -6303,7 +6422,7 @@
           <w:p>
             <w:r>
               <w:rPr>
-                <w:rFonts w:ascii="Aptos" w:hAnsi="Aptos"/>
+                <w:rFonts w:ascii="Arial" w:hAnsi="Arial" w:eastAsia="Arial"/>
                 <w:b w:val="0"/>
                 <w:color w:val="1F1F1F"/>
                 <w:sz w:val="19"/>
@@ -6337,7 +6456,7 @@
           <w:p>
             <w:r>
               <w:rPr>
-                <w:rFonts w:ascii="Aptos" w:hAnsi="Aptos"/>
+                <w:rFonts w:ascii="Arial" w:hAnsi="Arial" w:eastAsia="Arial"/>
                 <w:b/>
                 <w:color w:val="1F1F1F"/>
                 <w:sz w:val="19"/>
@@ -6369,7 +6488,7 @@
           <w:p>
             <w:r>
               <w:rPr>
-                <w:rFonts w:ascii="Aptos" w:hAnsi="Aptos"/>
+                <w:rFonts w:ascii="Arial" w:hAnsi="Arial" w:eastAsia="Arial"/>
                 <w:b w:val="0"/>
                 <w:color w:val="1F1F1F"/>
                 <w:sz w:val="19"/>
@@ -6402,7 +6521,7 @@
           <w:p>
             <w:r>
               <w:rPr>
-                <w:rFonts w:ascii="Aptos" w:hAnsi="Aptos"/>
+                <w:rFonts w:ascii="Arial" w:hAnsi="Arial" w:eastAsia="Arial"/>
                 <w:b/>
                 <w:color w:val="1F1F1F"/>
                 <w:sz w:val="19"/>
@@ -6433,7 +6552,7 @@
           <w:p>
             <w:r>
               <w:rPr>
-                <w:rFonts w:ascii="Aptos" w:hAnsi="Aptos"/>
+                <w:rFonts w:ascii="Arial" w:hAnsi="Arial" w:eastAsia="Arial"/>
                 <w:b w:val="0"/>
                 <w:color w:val="1F1F1F"/>
                 <w:sz w:val="19"/>
@@ -6467,7 +6586,7 @@
           <w:p>
             <w:r>
               <w:rPr>
-                <w:rFonts w:ascii="Aptos" w:hAnsi="Aptos"/>
+                <w:rFonts w:ascii="Arial" w:hAnsi="Arial" w:eastAsia="Arial"/>
                 <w:b/>
                 <w:color w:val="1F1F1F"/>
                 <w:sz w:val="19"/>
@@ -6499,7 +6618,7 @@
           <w:p>
             <w:r>
               <w:rPr>
-                <w:rFonts w:ascii="Aptos" w:hAnsi="Aptos"/>
+                <w:rFonts w:ascii="Arial" w:hAnsi="Arial" w:eastAsia="Arial"/>
                 <w:b w:val="0"/>
                 <w:color w:val="1F1F1F"/>
                 <w:sz w:val="19"/>
@@ -6531,7 +6650,7 @@
           <w:p>
             <w:r>
               <w:rPr>
-                <w:rFonts w:ascii="Aptos" w:hAnsi="Aptos"/>
+                <w:rFonts w:ascii="Arial" w:hAnsi="Arial" w:eastAsia="Arial"/>
                 <w:b/>
                 <w:color w:val="1F1F1F"/>
                 <w:sz w:val="19"/>
@@ -6562,7 +6681,7 @@
           <w:p>
             <w:r>
               <w:rPr>
-                <w:rFonts w:ascii="Aptos" w:hAnsi="Aptos"/>
+                <w:rFonts w:ascii="Arial" w:hAnsi="Arial" w:eastAsia="Arial"/>
                 <w:b w:val="0"/>
                 <w:color w:val="1F1F1F"/>
                 <w:sz w:val="19"/>
@@ -6578,7 +6697,7 @@
       </w:pPr>
       <w:r>
         <w:rPr>
-          <w:rFonts w:ascii="Aptos" w:hAnsi="Aptos"/>
+          <w:rFonts w:ascii="Arial" w:hAnsi="Arial" w:eastAsia="Arial"/>
           <w:b/>
           <w:color w:val="1F1F1F"/>
           <w:sz w:val="21"/>
@@ -6632,7 +6751,7 @@
       </w:pPr>
       <w:r>
         <w:rPr>
-          <w:rFonts w:ascii="Aptos" w:hAnsi="Aptos"/>
+          <w:rFonts w:ascii="Arial" w:hAnsi="Arial" w:eastAsia="Arial"/>
           <w:b/>
           <w:color w:val="1F1F1F"/>
           <w:sz w:val="21"/>
@@ -6686,7 +6805,7 @@
       </w:pPr>
       <w:r>
         <w:rPr>
-          <w:rFonts w:ascii="Aptos" w:hAnsi="Aptos"/>
+          <w:rFonts w:ascii="Arial" w:hAnsi="Arial" w:eastAsia="Arial"/>
           <w:b/>
           <w:color w:val="1F1F1F"/>
           <w:sz w:val="21"/>
@@ -6742,12 +6861,9 @@
       </w:pPr>
       <w:r>
         <w:rPr>
-          <w:rFonts w:ascii="Aptos" w:hAnsi="Aptos"/>
-          <w:b/>
-          <w:color w:val="1F1F1F"/>
-          <w:sz w:val="30"/>
+          <w:rFonts w:ascii="Arial" w:hAnsi="Arial" w:eastAsia="Arial"/>
         </w:rPr>
-        <w:t>Día 2 Evaluación inmediata</w:t>
+        <w:t>Día 2 Evaluación breve</w:t>
       </w:r>
     </w:p>
     <w:p>
@@ -6755,13 +6871,7 @@
         <w:spacing w:after="120"/>
       </w:pPr>
       <w:r>
-        <w:rPr>
-          <w:rFonts w:ascii="Aptos" w:hAnsi="Aptos"/>
-          <w:b w:val="0"/>
-          <w:color w:val="1F1F1F"/>
-          <w:sz w:val="21"/>
-        </w:rPr>
-        <w:t>Marcar una respuesta por afirmación. 1 significa totalmente en desacuerdo y 5 totalmente de acuerdo.</w:t>
+        <w:t>Marca una respuesta por afirmación. 1 significa totalmente en desacuerdo y 5 totalmente de acuerdo.</w:t>
       </w:r>
     </w:p>
     <w:tbl>
@@ -6809,7 +6919,7 @@
             </w:pPr>
             <w:r>
               <w:rPr>
-                <w:rFonts w:ascii="Aptos" w:hAnsi="Aptos"/>
+                <w:rFonts w:ascii="Arial" w:hAnsi="Arial" w:eastAsia="Arial"/>
                 <w:b/>
                 <w:color w:val="FFFFFF"/>
                 <w:sz w:val="18"/>
@@ -6844,7 +6954,7 @@
             </w:pPr>
             <w:r>
               <w:rPr>
-                <w:rFonts w:ascii="Aptos" w:hAnsi="Aptos"/>
+                <w:rFonts w:ascii="Arial" w:hAnsi="Arial" w:eastAsia="Arial"/>
                 <w:b/>
                 <w:color w:val="FFFFFF"/>
                 <w:sz w:val="18"/>
@@ -6879,7 +6989,7 @@
             </w:pPr>
             <w:r>
               <w:rPr>
-                <w:rFonts w:ascii="Aptos" w:hAnsi="Aptos"/>
+                <w:rFonts w:ascii="Arial" w:hAnsi="Arial" w:eastAsia="Arial"/>
                 <w:b/>
                 <w:color w:val="FFFFFF"/>
                 <w:sz w:val="18"/>
@@ -6914,7 +7024,7 @@
             </w:pPr>
             <w:r>
               <w:rPr>
-                <w:rFonts w:ascii="Aptos" w:hAnsi="Aptos"/>
+                <w:rFonts w:ascii="Arial" w:hAnsi="Arial" w:eastAsia="Arial"/>
                 <w:b/>
                 <w:color w:val="FFFFFF"/>
                 <w:sz w:val="18"/>
@@ -6949,7 +7059,7 @@
             </w:pPr>
             <w:r>
               <w:rPr>
-                <w:rFonts w:ascii="Aptos" w:hAnsi="Aptos"/>
+                <w:rFonts w:ascii="Arial" w:hAnsi="Arial" w:eastAsia="Arial"/>
                 <w:b/>
                 <w:color w:val="FFFFFF"/>
                 <w:sz w:val="18"/>
@@ -6984,7 +7094,7 @@
             </w:pPr>
             <w:r>
               <w:rPr>
-                <w:rFonts w:ascii="Aptos" w:hAnsi="Aptos"/>
+                <w:rFonts w:ascii="Arial" w:hAnsi="Arial" w:eastAsia="Arial"/>
                 <w:b/>
                 <w:color w:val="FFFFFF"/>
                 <w:sz w:val="18"/>
@@ -7020,7 +7130,7 @@
             </w:pPr>
             <w:r>
               <w:rPr>
-                <w:rFonts w:ascii="Aptos" w:hAnsi="Aptos"/>
+                <w:rFonts w:ascii="Arial" w:hAnsi="Arial" w:eastAsia="Arial"/>
                 <w:b w:val="0"/>
                 <w:color w:val="1F1F1F"/>
                 <w:sz w:val="18"/>
@@ -7054,7 +7164,7 @@
             </w:pPr>
             <w:r>
               <w:rPr>
-                <w:rFonts w:ascii="Aptos" w:hAnsi="Aptos"/>
+                <w:rFonts w:ascii="Arial" w:hAnsi="Arial" w:eastAsia="Arial"/>
                 <w:b w:val="0"/>
                 <w:color w:val="1F1F1F"/>
                 <w:sz w:val="18"/>
@@ -7088,7 +7198,7 @@
             </w:pPr>
             <w:r>
               <w:rPr>
-                <w:rFonts w:ascii="Aptos" w:hAnsi="Aptos"/>
+                <w:rFonts w:ascii="Arial" w:hAnsi="Arial" w:eastAsia="Arial"/>
                 <w:b w:val="0"/>
                 <w:color w:val="1F1F1F"/>
                 <w:sz w:val="18"/>
@@ -7122,7 +7232,7 @@
             </w:pPr>
             <w:r>
               <w:rPr>
-                <w:rFonts w:ascii="Aptos" w:hAnsi="Aptos"/>
+                <w:rFonts w:ascii="Arial" w:hAnsi="Arial" w:eastAsia="Arial"/>
                 <w:b w:val="0"/>
                 <w:color w:val="1F1F1F"/>
                 <w:sz w:val="18"/>
@@ -7156,7 +7266,7 @@
             </w:pPr>
             <w:r>
               <w:rPr>
-                <w:rFonts w:ascii="Aptos" w:hAnsi="Aptos"/>
+                <w:rFonts w:ascii="Arial" w:hAnsi="Arial" w:eastAsia="Arial"/>
                 <w:b w:val="0"/>
                 <w:color w:val="1F1F1F"/>
                 <w:sz w:val="18"/>
@@ -7190,7 +7300,7 @@
             </w:pPr>
             <w:r>
               <w:rPr>
-                <w:rFonts w:ascii="Aptos" w:hAnsi="Aptos"/>
+                <w:rFonts w:ascii="Arial" w:hAnsi="Arial" w:eastAsia="Arial"/>
                 <w:b w:val="0"/>
                 <w:color w:val="1F1F1F"/>
                 <w:sz w:val="18"/>
@@ -7227,7 +7337,7 @@
             </w:pPr>
             <w:r>
               <w:rPr>
-                <w:rFonts w:ascii="Aptos" w:hAnsi="Aptos"/>
+                <w:rFonts w:ascii="Arial" w:hAnsi="Arial" w:eastAsia="Arial"/>
                 <w:b w:val="0"/>
                 <w:color w:val="1F1F1F"/>
                 <w:sz w:val="18"/>
@@ -7262,7 +7372,7 @@
             </w:pPr>
             <w:r>
               <w:rPr>
-                <w:rFonts w:ascii="Aptos" w:hAnsi="Aptos"/>
+                <w:rFonts w:ascii="Arial" w:hAnsi="Arial" w:eastAsia="Arial"/>
                 <w:b w:val="0"/>
                 <w:color w:val="1F1F1F"/>
                 <w:sz w:val="18"/>
@@ -7297,7 +7407,7 @@
             </w:pPr>
             <w:r>
               <w:rPr>
-                <w:rFonts w:ascii="Aptos" w:hAnsi="Aptos"/>
+                <w:rFonts w:ascii="Arial" w:hAnsi="Arial" w:eastAsia="Arial"/>
                 <w:b w:val="0"/>
                 <w:color w:val="1F1F1F"/>
                 <w:sz w:val="18"/>
@@ -7332,7 +7442,7 @@
             </w:pPr>
             <w:r>
               <w:rPr>
-                <w:rFonts w:ascii="Aptos" w:hAnsi="Aptos"/>
+                <w:rFonts w:ascii="Arial" w:hAnsi="Arial" w:eastAsia="Arial"/>
                 <w:b w:val="0"/>
                 <w:color w:val="1F1F1F"/>
                 <w:sz w:val="18"/>
@@ -7367,7 +7477,7 @@
             </w:pPr>
             <w:r>
               <w:rPr>
-                <w:rFonts w:ascii="Aptos" w:hAnsi="Aptos"/>
+                <w:rFonts w:ascii="Arial" w:hAnsi="Arial" w:eastAsia="Arial"/>
                 <w:b w:val="0"/>
                 <w:color w:val="1F1F1F"/>
                 <w:sz w:val="18"/>
@@ -7402,7 +7512,7 @@
             </w:pPr>
             <w:r>
               <w:rPr>
-                <w:rFonts w:ascii="Aptos" w:hAnsi="Aptos"/>
+                <w:rFonts w:ascii="Arial" w:hAnsi="Arial" w:eastAsia="Arial"/>
                 <w:b w:val="0"/>
                 <w:color w:val="1F1F1F"/>
                 <w:sz w:val="18"/>
@@ -7438,7 +7548,7 @@
             </w:pPr>
             <w:r>
               <w:rPr>
-                <w:rFonts w:ascii="Aptos" w:hAnsi="Aptos"/>
+                <w:rFonts w:ascii="Arial" w:hAnsi="Arial" w:eastAsia="Arial"/>
                 <w:b w:val="0"/>
                 <w:color w:val="1F1F1F"/>
                 <w:sz w:val="18"/>
@@ -7472,7 +7582,7 @@
             </w:pPr>
             <w:r>
               <w:rPr>
-                <w:rFonts w:ascii="Aptos" w:hAnsi="Aptos"/>
+                <w:rFonts w:ascii="Arial" w:hAnsi="Arial" w:eastAsia="Arial"/>
                 <w:b w:val="0"/>
                 <w:color w:val="1F1F1F"/>
                 <w:sz w:val="18"/>
@@ -7506,7 +7616,7 @@
             </w:pPr>
             <w:r>
               <w:rPr>
-                <w:rFonts w:ascii="Aptos" w:hAnsi="Aptos"/>
+                <w:rFonts w:ascii="Arial" w:hAnsi="Arial" w:eastAsia="Arial"/>
                 <w:b w:val="0"/>
                 <w:color w:val="1F1F1F"/>
                 <w:sz w:val="18"/>
@@ -7540,7 +7650,7 @@
             </w:pPr>
             <w:r>
               <w:rPr>
-                <w:rFonts w:ascii="Aptos" w:hAnsi="Aptos"/>
+                <w:rFonts w:ascii="Arial" w:hAnsi="Arial" w:eastAsia="Arial"/>
                 <w:b w:val="0"/>
                 <w:color w:val="1F1F1F"/>
                 <w:sz w:val="18"/>
@@ -7574,7 +7684,7 @@
             </w:pPr>
             <w:r>
               <w:rPr>
-                <w:rFonts w:ascii="Aptos" w:hAnsi="Aptos"/>
+                <w:rFonts w:ascii="Arial" w:hAnsi="Arial" w:eastAsia="Arial"/>
                 <w:b w:val="0"/>
                 <w:color w:val="1F1F1F"/>
                 <w:sz w:val="18"/>
@@ -7608,7 +7718,7 @@
             </w:pPr>
             <w:r>
               <w:rPr>
-                <w:rFonts w:ascii="Aptos" w:hAnsi="Aptos"/>
+                <w:rFonts w:ascii="Arial" w:hAnsi="Arial" w:eastAsia="Arial"/>
                 <w:b w:val="0"/>
                 <w:color w:val="1F1F1F"/>
                 <w:sz w:val="18"/>
@@ -7645,7 +7755,7 @@
             </w:pPr>
             <w:r>
               <w:rPr>
-                <w:rFonts w:ascii="Aptos" w:hAnsi="Aptos"/>
+                <w:rFonts w:ascii="Arial" w:hAnsi="Arial" w:eastAsia="Arial"/>
                 <w:b w:val="0"/>
                 <w:color w:val="1F1F1F"/>
                 <w:sz w:val="18"/>
@@ -7680,7 +7790,7 @@
             </w:pPr>
             <w:r>
               <w:rPr>
-                <w:rFonts w:ascii="Aptos" w:hAnsi="Aptos"/>
+                <w:rFonts w:ascii="Arial" w:hAnsi="Arial" w:eastAsia="Arial"/>
                 <w:b w:val="0"/>
                 <w:color w:val="1F1F1F"/>
                 <w:sz w:val="18"/>
@@ -7715,7 +7825,7 @@
             </w:pPr>
             <w:r>
               <w:rPr>
-                <w:rFonts w:ascii="Aptos" w:hAnsi="Aptos"/>
+                <w:rFonts w:ascii="Arial" w:hAnsi="Arial" w:eastAsia="Arial"/>
                 <w:b w:val="0"/>
                 <w:color w:val="1F1F1F"/>
                 <w:sz w:val="18"/>
@@ -7750,7 +7860,7 @@
             </w:pPr>
             <w:r>
               <w:rPr>
-                <w:rFonts w:ascii="Aptos" w:hAnsi="Aptos"/>
+                <w:rFonts w:ascii="Arial" w:hAnsi="Arial" w:eastAsia="Arial"/>
                 <w:b w:val="0"/>
                 <w:color w:val="1F1F1F"/>
                 <w:sz w:val="18"/>
@@ -7785,7 +7895,7 @@
             </w:pPr>
             <w:r>
               <w:rPr>
-                <w:rFonts w:ascii="Aptos" w:hAnsi="Aptos"/>
+                <w:rFonts w:ascii="Arial" w:hAnsi="Arial" w:eastAsia="Arial"/>
                 <w:b w:val="0"/>
                 <w:color w:val="1F1F1F"/>
                 <w:sz w:val="18"/>
@@ -7820,7 +7930,7 @@
             </w:pPr>
             <w:r>
               <w:rPr>
-                <w:rFonts w:ascii="Aptos" w:hAnsi="Aptos"/>
+                <w:rFonts w:ascii="Arial" w:hAnsi="Arial" w:eastAsia="Arial"/>
                 <w:b w:val="0"/>
                 <w:color w:val="1F1F1F"/>
                 <w:sz w:val="18"/>
@@ -7856,7 +7966,7 @@
             </w:pPr>
             <w:r>
               <w:rPr>
-                <w:rFonts w:ascii="Aptos" w:hAnsi="Aptos"/>
+                <w:rFonts w:ascii="Arial" w:hAnsi="Arial" w:eastAsia="Arial"/>
                 <w:b w:val="0"/>
                 <w:color w:val="1F1F1F"/>
                 <w:sz w:val="18"/>
@@ -7890,7 +8000,7 @@
             </w:pPr>
             <w:r>
               <w:rPr>
-                <w:rFonts w:ascii="Aptos" w:hAnsi="Aptos"/>
+                <w:rFonts w:ascii="Arial" w:hAnsi="Arial" w:eastAsia="Arial"/>
                 <w:b w:val="0"/>
                 <w:color w:val="1F1F1F"/>
                 <w:sz w:val="18"/>
@@ -7924,7 +8034,7 @@
             </w:pPr>
             <w:r>
               <w:rPr>
-                <w:rFonts w:ascii="Aptos" w:hAnsi="Aptos"/>
+                <w:rFonts w:ascii="Arial" w:hAnsi="Arial" w:eastAsia="Arial"/>
                 <w:b w:val="0"/>
                 <w:color w:val="1F1F1F"/>
                 <w:sz w:val="18"/>
@@ -7958,7 +8068,7 @@
             </w:pPr>
             <w:r>
               <w:rPr>
-                <w:rFonts w:ascii="Aptos" w:hAnsi="Aptos"/>
+                <w:rFonts w:ascii="Arial" w:hAnsi="Arial" w:eastAsia="Arial"/>
                 <w:b w:val="0"/>
                 <w:color w:val="1F1F1F"/>
                 <w:sz w:val="18"/>
@@ -7992,7 +8102,7 @@
             </w:pPr>
             <w:r>
               <w:rPr>
-                <w:rFonts w:ascii="Aptos" w:hAnsi="Aptos"/>
+                <w:rFonts w:ascii="Arial" w:hAnsi="Arial" w:eastAsia="Arial"/>
                 <w:b w:val="0"/>
                 <w:color w:val="1F1F1F"/>
                 <w:sz w:val="18"/>
@@ -8026,7 +8136,7 @@
             </w:pPr>
             <w:r>
               <w:rPr>
-                <w:rFonts w:ascii="Aptos" w:hAnsi="Aptos"/>
+                <w:rFonts w:ascii="Arial" w:hAnsi="Arial" w:eastAsia="Arial"/>
                 <w:b w:val="0"/>
                 <w:color w:val="1F1F1F"/>
                 <w:sz w:val="18"/>
@@ -8063,7 +8173,7 @@
             </w:pPr>
             <w:r>
               <w:rPr>
-                <w:rFonts w:ascii="Aptos" w:hAnsi="Aptos"/>
+                <w:rFonts w:ascii="Arial" w:hAnsi="Arial" w:eastAsia="Arial"/>
                 <w:b w:val="0"/>
                 <w:color w:val="1F1F1F"/>
                 <w:sz w:val="18"/>
@@ -8098,7 +8208,7 @@
             </w:pPr>
             <w:r>
               <w:rPr>
-                <w:rFonts w:ascii="Aptos" w:hAnsi="Aptos"/>
+                <w:rFonts w:ascii="Arial" w:hAnsi="Arial" w:eastAsia="Arial"/>
                 <w:b w:val="0"/>
                 <w:color w:val="1F1F1F"/>
                 <w:sz w:val="18"/>
@@ -8133,7 +8243,7 @@
             </w:pPr>
             <w:r>
               <w:rPr>
-                <w:rFonts w:ascii="Aptos" w:hAnsi="Aptos"/>
+                <w:rFonts w:ascii="Arial" w:hAnsi="Arial" w:eastAsia="Arial"/>
                 <w:b w:val="0"/>
                 <w:color w:val="1F1F1F"/>
                 <w:sz w:val="18"/>
@@ -8168,7 +8278,7 @@
             </w:pPr>
             <w:r>
               <w:rPr>
-                <w:rFonts w:ascii="Aptos" w:hAnsi="Aptos"/>
+                <w:rFonts w:ascii="Arial" w:hAnsi="Arial" w:eastAsia="Arial"/>
                 <w:b w:val="0"/>
                 <w:color w:val="1F1F1F"/>
                 <w:sz w:val="18"/>
@@ -8203,7 +8313,7 @@
             </w:pPr>
             <w:r>
               <w:rPr>
-                <w:rFonts w:ascii="Aptos" w:hAnsi="Aptos"/>
+                <w:rFonts w:ascii="Arial" w:hAnsi="Arial" w:eastAsia="Arial"/>
                 <w:b w:val="0"/>
                 <w:color w:val="1F1F1F"/>
                 <w:sz w:val="18"/>
@@ -8238,7 +8348,7 @@
             </w:pPr>
             <w:r>
               <w:rPr>
-                <w:rFonts w:ascii="Aptos" w:hAnsi="Aptos"/>
+                <w:rFonts w:ascii="Arial" w:hAnsi="Arial" w:eastAsia="Arial"/>
                 <w:b w:val="0"/>
                 <w:color w:val="1F1F1F"/>
                 <w:sz w:val="18"/>
@@ -8274,7 +8384,7 @@
             </w:pPr>
             <w:r>
               <w:rPr>
-                <w:rFonts w:ascii="Aptos" w:hAnsi="Aptos"/>
+                <w:rFonts w:ascii="Arial" w:hAnsi="Arial" w:eastAsia="Arial"/>
                 <w:b w:val="0"/>
                 <w:color w:val="1F1F1F"/>
                 <w:sz w:val="18"/>
@@ -8308,7 +8418,7 @@
             </w:pPr>
             <w:r>
               <w:rPr>
-                <w:rFonts w:ascii="Aptos" w:hAnsi="Aptos"/>
+                <w:rFonts w:ascii="Arial" w:hAnsi="Arial" w:eastAsia="Arial"/>
                 <w:b w:val="0"/>
                 <w:color w:val="1F1F1F"/>
                 <w:sz w:val="18"/>
@@ -8342,7 +8452,7 @@
             </w:pPr>
             <w:r>
               <w:rPr>
-                <w:rFonts w:ascii="Aptos" w:hAnsi="Aptos"/>
+                <w:rFonts w:ascii="Arial" w:hAnsi="Arial" w:eastAsia="Arial"/>
                 <w:b w:val="0"/>
                 <w:color w:val="1F1F1F"/>
                 <w:sz w:val="18"/>
@@ -8376,7 +8486,7 @@
             </w:pPr>
             <w:r>
               <w:rPr>
-                <w:rFonts w:ascii="Aptos" w:hAnsi="Aptos"/>
+                <w:rFonts w:ascii="Arial" w:hAnsi="Arial" w:eastAsia="Arial"/>
                 <w:b w:val="0"/>
                 <w:color w:val="1F1F1F"/>
                 <w:sz w:val="18"/>
@@ -8410,7 +8520,7 @@
             </w:pPr>
             <w:r>
               <w:rPr>
-                <w:rFonts w:ascii="Aptos" w:hAnsi="Aptos"/>
+                <w:rFonts w:ascii="Arial" w:hAnsi="Arial" w:eastAsia="Arial"/>
                 <w:b w:val="0"/>
                 <w:color w:val="1F1F1F"/>
                 <w:sz w:val="18"/>
@@ -8444,7 +8554,7 @@
             </w:pPr>
             <w:r>
               <w:rPr>
-                <w:rFonts w:ascii="Aptos" w:hAnsi="Aptos"/>
+                <w:rFonts w:ascii="Arial" w:hAnsi="Arial" w:eastAsia="Arial"/>
                 <w:b w:val="0"/>
                 <w:color w:val="1F1F1F"/>
                 <w:sz w:val="18"/>
@@ -8481,7 +8591,7 @@
             </w:pPr>
             <w:r>
               <w:rPr>
-                <w:rFonts w:ascii="Aptos" w:hAnsi="Aptos"/>
+                <w:rFonts w:ascii="Arial" w:hAnsi="Arial" w:eastAsia="Arial"/>
                 <w:b w:val="0"/>
                 <w:color w:val="1F1F1F"/>
                 <w:sz w:val="18"/>
@@ -8516,7 +8626,7 @@
             </w:pPr>
             <w:r>
               <w:rPr>
-                <w:rFonts w:ascii="Aptos" w:hAnsi="Aptos"/>
+                <w:rFonts w:ascii="Arial" w:hAnsi="Arial" w:eastAsia="Arial"/>
                 <w:b w:val="0"/>
                 <w:color w:val="1F1F1F"/>
                 <w:sz w:val="18"/>
@@ -8551,7 +8661,7 @@
             </w:pPr>
             <w:r>
               <w:rPr>
-                <w:rFonts w:ascii="Aptos" w:hAnsi="Aptos"/>
+                <w:rFonts w:ascii="Arial" w:hAnsi="Arial" w:eastAsia="Arial"/>
                 <w:b w:val="0"/>
                 <w:color w:val="1F1F1F"/>
                 <w:sz w:val="18"/>
@@ -8586,7 +8696,7 @@
             </w:pPr>
             <w:r>
               <w:rPr>
-                <w:rFonts w:ascii="Aptos" w:hAnsi="Aptos"/>
+                <w:rFonts w:ascii="Arial" w:hAnsi="Arial" w:eastAsia="Arial"/>
                 <w:b w:val="0"/>
                 <w:color w:val="1F1F1F"/>
                 <w:sz w:val="18"/>
@@ -8621,7 +8731,7 @@
             </w:pPr>
             <w:r>
               <w:rPr>
-                <w:rFonts w:ascii="Aptos" w:hAnsi="Aptos"/>
+                <w:rFonts w:ascii="Arial" w:hAnsi="Arial" w:eastAsia="Arial"/>
                 <w:b w:val="0"/>
                 <w:color w:val="1F1F1F"/>
                 <w:sz w:val="18"/>
@@ -8656,7 +8766,7 @@
             </w:pPr>
             <w:r>
               <w:rPr>
-                <w:rFonts w:ascii="Aptos" w:hAnsi="Aptos"/>
+                <w:rFonts w:ascii="Arial" w:hAnsi="Arial" w:eastAsia="Arial"/>
                 <w:b w:val="0"/>
                 <w:color w:val="1F1F1F"/>
                 <w:sz w:val="18"/>
@@ -8675,12 +8785,9 @@
       </w:pPr>
       <w:r>
         <w:rPr>
-          <w:rFonts w:ascii="Aptos" w:hAnsi="Aptos"/>
-          <w:b/>
-          <w:color w:val="1F1F1F"/>
-          <w:sz w:val="30"/>
+          <w:rFonts w:ascii="Arial" w:hAnsi="Arial" w:eastAsia="Arial"/>
         </w:rPr>
-        <w:t>Día 2 Conversación posterior</w:t>
+        <w:t>Día 2 Conversación de cierre</w:t>
       </w:r>
     </w:p>
     <w:p>
@@ -8690,7 +8797,7 @@
       </w:pPr>
       <w:r>
         <w:rPr>
-          <w:rFonts w:ascii="Aptos" w:hAnsi="Aptos"/>
+          <w:rFonts w:ascii="Arial" w:hAnsi="Arial" w:eastAsia="Arial"/>
           <w:b/>
           <w:color w:val="1F1F1F"/>
           <w:sz w:val="23"/>
@@ -8704,7 +8811,7 @@
       </w:pPr>
       <w:r>
         <w:rPr>
-          <w:rFonts w:ascii="Aptos" w:hAnsi="Aptos"/>
+          <w:rFonts w:ascii="Arial" w:hAnsi="Arial" w:eastAsia="Arial"/>
           <w:b/>
           <w:color w:val="1F1F1F"/>
           <w:sz w:val="21"/>
@@ -8758,7 +8865,7 @@
       </w:pPr>
       <w:r>
         <w:rPr>
-          <w:rFonts w:ascii="Aptos" w:hAnsi="Aptos"/>
+          <w:rFonts w:ascii="Arial" w:hAnsi="Arial" w:eastAsia="Arial"/>
           <w:b/>
           <w:color w:val="1F1F1F"/>
           <w:sz w:val="21"/>
@@ -8812,7 +8919,7 @@
       </w:pPr>
       <w:r>
         <w:rPr>
-          <w:rFonts w:ascii="Aptos" w:hAnsi="Aptos"/>
+          <w:rFonts w:ascii="Arial" w:hAnsi="Arial" w:eastAsia="Arial"/>
           <w:b/>
           <w:color w:val="1F1F1F"/>
           <w:sz w:val="21"/>
@@ -8866,7 +8973,7 @@
       </w:pPr>
       <w:r>
         <w:rPr>
-          <w:rFonts w:ascii="Aptos" w:hAnsi="Aptos"/>
+          <w:rFonts w:ascii="Arial" w:hAnsi="Arial" w:eastAsia="Arial"/>
           <w:b/>
           <w:color w:val="1F1F1F"/>
           <w:sz w:val="21"/>
@@ -8920,7 +9027,7 @@
       </w:pPr>
       <w:r>
         <w:rPr>
-          <w:rFonts w:ascii="Aptos" w:hAnsi="Aptos"/>
+          <w:rFonts w:ascii="Arial" w:hAnsi="Arial" w:eastAsia="Arial"/>
           <w:b/>
           <w:color w:val="1F1F1F"/>
           <w:sz w:val="21"/>
@@ -8976,7 +9083,7 @@
       </w:pPr>
       <w:r>
         <w:rPr>
-          <w:rFonts w:ascii="Aptos" w:hAnsi="Aptos"/>
+          <w:rFonts w:ascii="Arial" w:hAnsi="Arial" w:eastAsia="Arial"/>
           <w:b/>
           <w:color w:val="1F1F1F"/>
           <w:sz w:val="30"/>
@@ -8990,7 +9097,7 @@
       </w:pPr>
       <w:r>
         <w:rPr>
-          <w:rFonts w:ascii="Aptos" w:hAnsi="Aptos"/>
+          <w:rFonts w:ascii="Arial" w:hAnsi="Arial" w:eastAsia="Arial"/>
           <w:b/>
           <w:color w:val="1F1F1F"/>
           <w:sz w:val="21"/>
@@ -9044,7 +9151,7 @@
       </w:pPr>
       <w:r>
         <w:rPr>
-          <w:rFonts w:ascii="Aptos" w:hAnsi="Aptos"/>
+          <w:rFonts w:ascii="Arial" w:hAnsi="Arial" w:eastAsia="Arial"/>
           <w:b/>
           <w:color w:val="1F1F1F"/>
           <w:sz w:val="21"/>
@@ -9098,7 +9205,7 @@
       </w:pPr>
       <w:r>
         <w:rPr>
-          <w:rFonts w:ascii="Aptos" w:hAnsi="Aptos"/>
+          <w:rFonts w:ascii="Arial" w:hAnsi="Arial" w:eastAsia="Arial"/>
           <w:b/>
           <w:color w:val="1F1F1F"/>
           <w:sz w:val="21"/>
@@ -9152,7 +9259,7 @@
       </w:pPr>
       <w:r>
         <w:rPr>
-          <w:rFonts w:ascii="Aptos" w:hAnsi="Aptos"/>
+          <w:rFonts w:ascii="Arial" w:hAnsi="Arial" w:eastAsia="Arial"/>
           <w:b/>
           <w:color w:val="1F1F1F"/>
           <w:sz w:val="21"/>
@@ -9206,7 +9313,7 @@
       </w:pPr>
       <w:r>
         <w:rPr>
-          <w:rFonts w:ascii="Aptos" w:hAnsi="Aptos"/>
+          <w:rFonts w:ascii="Arial" w:hAnsi="Arial" w:eastAsia="Arial"/>
           <w:b/>
           <w:color w:val="1F1F1F"/>
           <w:sz w:val="21"/>
@@ -9260,7 +9367,7 @@
       </w:pPr>
       <w:r>
         <w:rPr>
-          <w:rFonts w:ascii="Aptos" w:hAnsi="Aptos"/>
+          <w:rFonts w:ascii="Arial" w:hAnsi="Arial" w:eastAsia="Arial"/>
           <w:b/>
           <w:color w:val="1F1F1F"/>
           <w:sz w:val="21"/>
@@ -9314,7 +9421,7 @@
       </w:pPr>
       <w:r>
         <w:rPr>
-          <w:rFonts w:ascii="Aptos" w:hAnsi="Aptos"/>
+          <w:rFonts w:ascii="Arial" w:hAnsi="Arial" w:eastAsia="Arial"/>
           <w:b/>
           <w:color w:val="1F1F1F"/>
           <w:sz w:val="21"/>
@@ -9368,7 +9475,7 @@
       </w:pPr>
       <w:r>
         <w:rPr>
-          <w:rFonts w:ascii="Aptos" w:hAnsi="Aptos"/>
+          <w:rFonts w:ascii="Arial" w:hAnsi="Arial" w:eastAsia="Arial"/>
           <w:b/>
           <w:color w:val="1F1F1F"/>
           <w:sz w:val="21"/>
@@ -9424,12 +9531,9 @@
       </w:pPr>
       <w:r>
         <w:rPr>
-          <w:rFonts w:ascii="Aptos" w:hAnsi="Aptos"/>
-          <w:b/>
-          <w:color w:val="1F1F1F"/>
-          <w:sz w:val="30"/>
+          <w:rFonts w:ascii="Arial" w:hAnsi="Arial" w:eastAsia="Arial"/>
         </w:rPr>
-        <w:t>Síntesis del investigador</w:t>
+        <w:t>Resumen de lo observado</w:t>
       </w:r>
     </w:p>
     <w:tbl>
@@ -9470,7 +9574,7 @@
           <w:p>
             <w:r>
               <w:rPr>
-                <w:rFonts w:ascii="Aptos" w:hAnsi="Aptos"/>
+                <w:rFonts w:ascii="Arial" w:hAnsi="Arial" w:eastAsia="Arial"/>
                 <w:b/>
                 <w:color w:val="FFFFFF"/>
                 <w:sz w:val="18"/>
@@ -9501,7 +9605,7 @@
           <w:p>
             <w:r>
               <w:rPr>
-                <w:rFonts w:ascii="Aptos" w:hAnsi="Aptos"/>
+                <w:rFonts w:ascii="Arial" w:hAnsi="Arial" w:eastAsia="Arial"/>
                 <w:b/>
                 <w:color w:val="FFFFFF"/>
                 <w:sz w:val="18"/>
@@ -9532,7 +9636,7 @@
           <w:p>
             <w:r>
               <w:rPr>
-                <w:rFonts w:ascii="Aptos" w:hAnsi="Aptos"/>
+                <w:rFonts w:ascii="Arial" w:hAnsi="Arial" w:eastAsia="Arial"/>
                 <w:b/>
                 <w:color w:val="FFFFFF"/>
                 <w:sz w:val="18"/>
@@ -9565,7 +9669,7 @@
           <w:p>
             <w:r>
               <w:rPr>
-                <w:rFonts w:ascii="Aptos" w:hAnsi="Aptos"/>
+                <w:rFonts w:ascii="Arial" w:hAnsi="Arial" w:eastAsia="Arial"/>
                 <w:b/>
                 <w:color w:val="1F1F1F"/>
                 <w:sz w:val="17"/>
@@ -9596,7 +9700,7 @@
           <w:p>
             <w:r>
               <w:rPr>
-                <w:rFonts w:ascii="Aptos" w:hAnsi="Aptos"/>
+                <w:rFonts w:ascii="Arial" w:hAnsi="Arial" w:eastAsia="Arial"/>
                 <w:b w:val="0"/>
                 <w:color w:val="1F1F1F"/>
                 <w:sz w:val="17"/>
@@ -9627,7 +9731,7 @@
           <w:p>
             <w:r>
               <w:rPr>
-                <w:rFonts w:ascii="Aptos" w:hAnsi="Aptos"/>
+                <w:rFonts w:ascii="Arial" w:hAnsi="Arial" w:eastAsia="Arial"/>
                 <w:b w:val="0"/>
                 <w:color w:val="1F1F1F"/>
                 <w:sz w:val="17"/>
@@ -9660,7 +9764,7 @@
           <w:p>
             <w:r>
               <w:rPr>
-                <w:rFonts w:ascii="Aptos" w:hAnsi="Aptos"/>
+                <w:rFonts w:ascii="Arial" w:hAnsi="Arial" w:eastAsia="Arial"/>
                 <w:b/>
                 <w:color w:val="1F1F1F"/>
                 <w:sz w:val="17"/>
@@ -9692,7 +9796,7 @@
           <w:p>
             <w:r>
               <w:rPr>
-                <w:rFonts w:ascii="Aptos" w:hAnsi="Aptos"/>
+                <w:rFonts w:ascii="Arial" w:hAnsi="Arial" w:eastAsia="Arial"/>
                 <w:b w:val="0"/>
                 <w:color w:val="1F1F1F"/>
                 <w:sz w:val="17"/>
@@ -9724,7 +9828,7 @@
           <w:p>
             <w:r>
               <w:rPr>
-                <w:rFonts w:ascii="Aptos" w:hAnsi="Aptos"/>
+                <w:rFonts w:ascii="Arial" w:hAnsi="Arial" w:eastAsia="Arial"/>
                 <w:b w:val="0"/>
                 <w:color w:val="1F1F1F"/>
                 <w:sz w:val="17"/>
@@ -9756,7 +9860,7 @@
           <w:p>
             <w:r>
               <w:rPr>
-                <w:rFonts w:ascii="Aptos" w:hAnsi="Aptos"/>
+                <w:rFonts w:ascii="Arial" w:hAnsi="Arial" w:eastAsia="Arial"/>
                 <w:b/>
                 <w:color w:val="1F1F1F"/>
                 <w:sz w:val="17"/>
@@ -9787,7 +9891,7 @@
           <w:p>
             <w:r>
               <w:rPr>
-                <w:rFonts w:ascii="Aptos" w:hAnsi="Aptos"/>
+                <w:rFonts w:ascii="Arial" w:hAnsi="Arial" w:eastAsia="Arial"/>
                 <w:b w:val="0"/>
                 <w:color w:val="1F1F1F"/>
                 <w:sz w:val="17"/>
@@ -9818,7 +9922,7 @@
           <w:p>
             <w:r>
               <w:rPr>
-                <w:rFonts w:ascii="Aptos" w:hAnsi="Aptos"/>
+                <w:rFonts w:ascii="Arial" w:hAnsi="Arial" w:eastAsia="Arial"/>
                 <w:b w:val="0"/>
                 <w:color w:val="1F1F1F"/>
                 <w:sz w:val="17"/>
@@ -9851,7 +9955,7 @@
           <w:p>
             <w:r>
               <w:rPr>
-                <w:rFonts w:ascii="Aptos" w:hAnsi="Aptos"/>
+                <w:rFonts w:ascii="Arial" w:hAnsi="Arial" w:eastAsia="Arial"/>
                 <w:b/>
                 <w:color w:val="1F1F1F"/>
                 <w:sz w:val="17"/>
@@ -9883,7 +9987,7 @@
           <w:p>
             <w:r>
               <w:rPr>
-                <w:rFonts w:ascii="Aptos" w:hAnsi="Aptos"/>
+                <w:rFonts w:ascii="Arial" w:hAnsi="Arial" w:eastAsia="Arial"/>
                 <w:b w:val="0"/>
                 <w:color w:val="1F1F1F"/>
                 <w:sz w:val="17"/>
@@ -9915,7 +10019,7 @@
           <w:p>
             <w:r>
               <w:rPr>
-                <w:rFonts w:ascii="Aptos" w:hAnsi="Aptos"/>
+                <w:rFonts w:ascii="Arial" w:hAnsi="Arial" w:eastAsia="Arial"/>
                 <w:b w:val="0"/>
                 <w:color w:val="1F1F1F"/>
                 <w:sz w:val="17"/>
@@ -9947,7 +10051,7 @@
           <w:p>
             <w:r>
               <w:rPr>
-                <w:rFonts w:ascii="Aptos" w:hAnsi="Aptos"/>
+                <w:rFonts w:ascii="Arial" w:hAnsi="Arial" w:eastAsia="Arial"/>
                 <w:b/>
                 <w:color w:val="1F1F1F"/>
                 <w:sz w:val="17"/>
@@ -9978,7 +10082,7 @@
           <w:p>
             <w:r>
               <w:rPr>
-                <w:rFonts w:ascii="Aptos" w:hAnsi="Aptos"/>
+                <w:rFonts w:ascii="Arial" w:hAnsi="Arial" w:eastAsia="Arial"/>
                 <w:b w:val="0"/>
                 <w:color w:val="1F1F1F"/>
                 <w:sz w:val="17"/>
@@ -10009,7 +10113,7 @@
           <w:p>
             <w:r>
               <w:rPr>
-                <w:rFonts w:ascii="Aptos" w:hAnsi="Aptos"/>
+                <w:rFonts w:ascii="Arial" w:hAnsi="Arial" w:eastAsia="Arial"/>
                 <w:b w:val="0"/>
                 <w:color w:val="1F1F1F"/>
                 <w:sz w:val="17"/>
@@ -10042,7 +10146,7 @@
           <w:p>
             <w:r>
               <w:rPr>
-                <w:rFonts w:ascii="Aptos" w:hAnsi="Aptos"/>
+                <w:rFonts w:ascii="Arial" w:hAnsi="Arial" w:eastAsia="Arial"/>
                 <w:b/>
                 <w:color w:val="1F1F1F"/>
                 <w:sz w:val="17"/>
@@ -10074,7 +10178,7 @@
           <w:p>
             <w:r>
               <w:rPr>
-                <w:rFonts w:ascii="Aptos" w:hAnsi="Aptos"/>
+                <w:rFonts w:ascii="Arial" w:hAnsi="Arial" w:eastAsia="Arial"/>
                 <w:b w:val="0"/>
                 <w:color w:val="1F1F1F"/>
                 <w:sz w:val="17"/>
@@ -10106,7 +10210,7 @@
           <w:p>
             <w:r>
               <w:rPr>
-                <w:rFonts w:ascii="Aptos" w:hAnsi="Aptos"/>
+                <w:rFonts w:ascii="Arial" w:hAnsi="Arial" w:eastAsia="Arial"/>
                 <w:b w:val="0"/>
                 <w:color w:val="1F1F1F"/>
                 <w:sz w:val="17"/>
@@ -10138,7 +10242,7 @@
           <w:p>
             <w:r>
               <w:rPr>
-                <w:rFonts w:ascii="Aptos" w:hAnsi="Aptos"/>
+                <w:rFonts w:ascii="Arial" w:hAnsi="Arial" w:eastAsia="Arial"/>
                 <w:b/>
                 <w:color w:val="1F1F1F"/>
                 <w:sz w:val="17"/>
@@ -10169,7 +10273,7 @@
           <w:p>
             <w:r>
               <w:rPr>
-                <w:rFonts w:ascii="Aptos" w:hAnsi="Aptos"/>
+                <w:rFonts w:ascii="Arial" w:hAnsi="Arial" w:eastAsia="Arial"/>
                 <w:b w:val="0"/>
                 <w:color w:val="1F1F1F"/>
                 <w:sz w:val="17"/>
@@ -10200,7 +10304,7 @@
           <w:p>
             <w:r>
               <w:rPr>
-                <w:rFonts w:ascii="Aptos" w:hAnsi="Aptos"/>
+                <w:rFonts w:ascii="Arial" w:hAnsi="Arial" w:eastAsia="Arial"/>
                 <w:b w:val="0"/>
                 <w:color w:val="1F1F1F"/>
                 <w:sz w:val="17"/>
@@ -10233,7 +10337,7 @@
           <w:p>
             <w:r>
               <w:rPr>
-                <w:rFonts w:ascii="Aptos" w:hAnsi="Aptos"/>
+                <w:rFonts w:ascii="Arial" w:hAnsi="Arial" w:eastAsia="Arial"/>
                 <w:b/>
                 <w:color w:val="1F1F1F"/>
                 <w:sz w:val="17"/>
@@ -10265,7 +10369,7 @@
           <w:p>
             <w:r>
               <w:rPr>
-                <w:rFonts w:ascii="Aptos" w:hAnsi="Aptos"/>
+                <w:rFonts w:ascii="Arial" w:hAnsi="Arial" w:eastAsia="Arial"/>
                 <w:b w:val="0"/>
                 <w:color w:val="1F1F1F"/>
                 <w:sz w:val="17"/>
@@ -10297,7 +10401,7 @@
           <w:p>
             <w:r>
               <w:rPr>
-                <w:rFonts w:ascii="Aptos" w:hAnsi="Aptos"/>
+                <w:rFonts w:ascii="Arial" w:hAnsi="Arial" w:eastAsia="Arial"/>
                 <w:b w:val="0"/>
                 <w:color w:val="1F1F1F"/>
                 <w:sz w:val="17"/>
@@ -10329,7 +10433,7 @@
           <w:p>
             <w:r>
               <w:rPr>
-                <w:rFonts w:ascii="Aptos" w:hAnsi="Aptos"/>
+                <w:rFonts w:ascii="Arial" w:hAnsi="Arial" w:eastAsia="Arial"/>
                 <w:b/>
                 <w:color w:val="1F1F1F"/>
                 <w:sz w:val="17"/>
@@ -10360,7 +10464,7 @@
           <w:p>
             <w:r>
               <w:rPr>
-                <w:rFonts w:ascii="Aptos" w:hAnsi="Aptos"/>
+                <w:rFonts w:ascii="Arial" w:hAnsi="Arial" w:eastAsia="Arial"/>
                 <w:b w:val="0"/>
                 <w:color w:val="1F1F1F"/>
                 <w:sz w:val="17"/>
@@ -10391,7 +10495,7 @@
           <w:p>
             <w:r>
               <w:rPr>
-                <w:rFonts w:ascii="Aptos" w:hAnsi="Aptos"/>
+                <w:rFonts w:ascii="Arial" w:hAnsi="Arial" w:eastAsia="Arial"/>
                 <w:b w:val="0"/>
                 <w:color w:val="1F1F1F"/>
                 <w:sz w:val="17"/>
@@ -10424,7 +10528,7 @@
           <w:p>
             <w:r>
               <w:rPr>
-                <w:rFonts w:ascii="Aptos" w:hAnsi="Aptos"/>
+                <w:rFonts w:ascii="Arial" w:hAnsi="Arial" w:eastAsia="Arial"/>
                 <w:b/>
                 <w:color w:val="1F1F1F"/>
                 <w:sz w:val="17"/>
@@ -10456,7 +10560,7 @@
           <w:p>
             <w:r>
               <w:rPr>
-                <w:rFonts w:ascii="Aptos" w:hAnsi="Aptos"/>
+                <w:rFonts w:ascii="Arial" w:hAnsi="Arial" w:eastAsia="Arial"/>
                 <w:b w:val="0"/>
                 <w:color w:val="1F1F1F"/>
                 <w:sz w:val="17"/>
@@ -10488,7 +10592,7 @@
           <w:p>
             <w:r>
               <w:rPr>
-                <w:rFonts w:ascii="Aptos" w:hAnsi="Aptos"/>
+                <w:rFonts w:ascii="Arial" w:hAnsi="Arial" w:eastAsia="Arial"/>
                 <w:b w:val="0"/>
                 <w:color w:val="1F1F1F"/>
                 <w:sz w:val="17"/>
@@ -10504,7 +10608,7 @@
       </w:pPr>
       <w:r>
         <w:rPr>
-          <w:rFonts w:ascii="Aptos" w:hAnsi="Aptos"/>
+          <w:rFonts w:ascii="Arial" w:hAnsi="Arial" w:eastAsia="Arial"/>
           <w:b/>
           <w:color w:val="1F1F1F"/>
           <w:sz w:val="21"/>
@@ -10558,7 +10662,7 @@
       </w:pPr>
       <w:r>
         <w:rPr>
-          <w:rFonts w:ascii="Aptos" w:hAnsi="Aptos"/>
+          <w:rFonts w:ascii="Arial" w:hAnsi="Arial" w:eastAsia="Arial"/>
           <w:b/>
           <w:color w:val="1F1F1F"/>
           <w:sz w:val="21"/>
@@ -10612,12 +10716,10 @@
       </w:pPr>
       <w:r>
         <w:rPr>
-          <w:rFonts w:ascii="Aptos" w:hAnsi="Aptos"/>
+          <w:rFonts w:ascii="Arial" w:hAnsi="Arial" w:eastAsia="Arial"/>
           <w:b/>
-          <w:color w:val="1F1F1F"/>
-          <w:sz w:val="21"/>
         </w:rPr>
-        <w:t>Necesidades expresadas por la participante</w:t>
+        <w:t>Necesidades expresadas por la persona</w:t>
       </w:r>
     </w:p>
     <w:tbl>
@@ -10666,7 +10768,7 @@
       </w:pPr>
       <w:r>
         <w:rPr>
-          <w:rFonts w:ascii="Aptos" w:hAnsi="Aptos"/>
+          <w:rFonts w:ascii="Arial" w:hAnsi="Arial" w:eastAsia="Arial"/>
           <w:b/>
           <w:color w:val="1F1F1F"/>
           <w:sz w:val="21"/>
@@ -10722,12 +10824,9 @@
       </w:pPr>
       <w:r>
         <w:rPr>
-          <w:rFonts w:ascii="Aptos" w:hAnsi="Aptos"/>
-          <w:b/>
-          <w:color w:val="1F1F1F"/>
-          <w:sz w:val="30"/>
+          <w:rFonts w:ascii="Arial" w:hAnsi="Arial" w:eastAsia="Arial"/>
         </w:rPr>
-        <w:t>Criterios preliminares de revisión</w:t>
+        <w:t>Decisiones después de la prueba</w:t>
       </w:r>
     </w:p>
     <w:p>
@@ -10736,12 +10835,9 @@
       </w:pPr>
       <w:r>
         <w:rPr>
-          <w:rFonts w:ascii="Aptos" w:hAnsi="Aptos"/>
-          <w:b w:val="0"/>
-          <w:color w:val="1F1F1F"/>
-          <w:sz w:val="21"/>
+          <w:rFonts w:ascii="Arial" w:hAnsi="Arial" w:eastAsia="Arial"/>
         </w:rPr>
-        <w:t>Estos criterios orientan la siguiente iteración del prototipo. No representan resultados generalizables.</w:t>
+        <w:t>Usa estos criterios para decidir qué conviene mantener, cambiar o volver a probar. Son aprendizajes de una prueba formativa y no resultados generalizables.</w:t>
       </w:r>
     </w:p>
     <w:tbl>
@@ -10780,7 +10876,7 @@
             </w:pPr>
             <w:r>
               <w:rPr>
-                <w:rFonts w:ascii="Aptos" w:hAnsi="Aptos"/>
+                <w:rFonts w:ascii="Arial" w:hAnsi="Arial" w:eastAsia="Arial"/>
                 <w:b w:val="0"/>
                 <w:color w:val="1F1F1F"/>
                 <w:sz w:val="21"/>
@@ -10816,7 +10912,7 @@
             </w:pPr>
             <w:r>
               <w:rPr>
-                <w:rFonts w:ascii="Aptos" w:hAnsi="Aptos"/>
+                <w:rFonts w:ascii="Arial" w:hAnsi="Arial" w:eastAsia="Arial"/>
                 <w:b w:val="0"/>
                 <w:color w:val="1F1F1F"/>
                 <w:sz w:val="21"/>
@@ -10852,7 +10948,7 @@
             </w:pPr>
             <w:r>
               <w:rPr>
-                <w:rFonts w:ascii="Aptos" w:hAnsi="Aptos"/>
+                <w:rFonts w:ascii="Arial" w:hAnsi="Arial" w:eastAsia="Arial"/>
                 <w:b w:val="0"/>
                 <w:color w:val="1F1F1F"/>
                 <w:sz w:val="21"/>
@@ -10888,7 +10984,7 @@
             </w:pPr>
             <w:r>
               <w:rPr>
-                <w:rFonts w:ascii="Aptos" w:hAnsi="Aptos"/>
+                <w:rFonts w:ascii="Arial" w:hAnsi="Arial" w:eastAsia="Arial"/>
                 <w:b w:val="0"/>
                 <w:color w:val="1F1F1F"/>
                 <w:sz w:val="21"/>
@@ -10923,13 +11019,7 @@
               <w:spacing w:after="0"/>
             </w:pPr>
             <w:r>
-              <w:rPr>
-                <w:rFonts w:ascii="Aptos" w:hAnsi="Aptos"/>
-                <w:b w:val="0"/>
-                <w:color w:val="1F1F1F"/>
-                <w:sz w:val="21"/>
-              </w:rPr>
-              <w:t>[ ] La señal no fue percibida como presión indebida.</w:t>
+              <w:t>[ ] La señal no se sintió como una orden.</w:t>
             </w:r>
           </w:p>
         </w:tc>
@@ -10960,7 +11050,7 @@
             </w:pPr>
             <w:r>
               <w:rPr>
-                <w:rFonts w:ascii="Aptos" w:hAnsi="Aptos"/>
+                <w:rFonts w:ascii="Arial" w:hAnsi="Arial" w:eastAsia="Arial"/>
                 <w:b w:val="0"/>
                 <w:color w:val="1F1F1F"/>
                 <w:sz w:val="21"/>
@@ -10996,7 +11086,7 @@
             </w:pPr>
             <w:r>
               <w:rPr>
-                <w:rFonts w:ascii="Aptos" w:hAnsi="Aptos"/>
+                <w:rFonts w:ascii="Arial" w:hAnsi="Arial" w:eastAsia="Arial"/>
                 <w:b w:val="0"/>
                 <w:color w:val="1F1F1F"/>
                 <w:sz w:val="21"/>
@@ -11013,7 +11103,7 @@
       </w:pPr>
       <w:r>
         <w:rPr>
-          <w:rFonts w:ascii="Aptos" w:hAnsi="Aptos"/>
+          <w:rFonts w:ascii="Arial" w:hAnsi="Arial" w:eastAsia="Arial"/>
           <w:b/>
           <w:color w:val="1F1F1F"/>
           <w:sz w:val="21"/>
@@ -11067,7 +11157,7 @@
       </w:pPr>
       <w:r>
         <w:rPr>
-          <w:rFonts w:ascii="Aptos" w:hAnsi="Aptos"/>
+          <w:rFonts w:ascii="Arial" w:hAnsi="Arial" w:eastAsia="Arial"/>
           <w:b/>
           <w:color w:val="1F1F1F"/>
           <w:sz w:val="21"/>
@@ -11121,7 +11211,7 @@
       </w:pPr>
       <w:r>
         <w:rPr>
-          <w:rFonts w:ascii="Aptos" w:hAnsi="Aptos"/>
+          <w:rFonts w:ascii="Arial" w:hAnsi="Arial" w:eastAsia="Arial"/>
           <w:b/>
           <w:color w:val="1F1F1F"/>
           <w:sz w:val="21"/>
@@ -11175,7 +11265,7 @@
       </w:pPr>
       <w:r>
         <w:rPr>
-          <w:rFonts w:ascii="Aptos" w:hAnsi="Aptos"/>
+          <w:rFonts w:ascii="Arial" w:hAnsi="Arial" w:eastAsia="Arial"/>
           <w:b/>
           <w:color w:val="1F1F1F"/>
           <w:sz w:val="21"/>
@@ -11257,7 +11347,7 @@
           <w:p>
             <w:r>
               <w:rPr>
-                <w:rFonts w:ascii="Aptos" w:hAnsi="Aptos"/>
+                <w:rFonts w:ascii="Arial" w:hAnsi="Arial" w:eastAsia="Arial"/>
                 <w:b/>
                 <w:color w:val="1F1F1F"/>
                 <w:sz w:val="19"/>
@@ -11265,11 +11355,14 @@
               <w:t>Responsable del registro</w:t>
             </w:r>
             <w:r>
+              <w:rPr>
+                <w:rFonts w:ascii="Arial" w:hAnsi="Arial" w:eastAsia="Arial"/>
+              </w:rPr>
               <w:br/>
             </w:r>
             <w:r>
               <w:rPr>
-                <w:rFonts w:ascii="Aptos" w:hAnsi="Aptos"/>
+                <w:rFonts w:ascii="Arial" w:hAnsi="Arial" w:eastAsia="Arial"/>
                 <w:b w:val="0"/>
                 <w:color w:val="1F1F1F"/>
                 <w:sz w:val="21"/>
@@ -11300,7 +11393,7 @@
           <w:p>
             <w:r>
               <w:rPr>
-                <w:rFonts w:ascii="Aptos" w:hAnsi="Aptos"/>
+                <w:rFonts w:ascii="Arial" w:hAnsi="Arial" w:eastAsia="Arial"/>
                 <w:b/>
                 <w:color w:val="1F1F1F"/>
                 <w:sz w:val="19"/>
@@ -11308,11 +11401,14 @@
               <w:t>Fecha de cierre del instrumento</w:t>
             </w:r>
             <w:r>
+              <w:rPr>
+                <w:rFonts w:ascii="Arial" w:hAnsi="Arial" w:eastAsia="Arial"/>
+              </w:rPr>
               <w:br/>
             </w:r>
             <w:r>
               <w:rPr>
-                <w:rFonts w:ascii="Aptos" w:hAnsi="Aptos"/>
+                <w:rFonts w:ascii="Arial" w:hAnsi="Arial" w:eastAsia="Arial"/>
                 <w:b w:val="0"/>
                 <w:color w:val="1F1F1F"/>
                 <w:sz w:val="21"/>
@@ -11344,9 +11440,9 @@
     </w:pPr>
     <w:r>
       <w:rPr>
-        <w:rFonts w:ascii="Aptos" w:hAnsi="Aptos"/>
+        <w:rFonts w:ascii="Arial" w:hAnsi="Arial" w:eastAsia="Arial"/>
         <w:b w:val="0"/>
-        <w:color w:val="666666"/>
+        <w:color w:val="606060"/>
         <w:sz w:val="17"/>
       </w:rPr>
       <w:t xml:space="preserve">Página </w:t>
@@ -11369,10 +11465,10 @@
     </w:pPr>
     <w:r>
       <w:rPr>
-        <w:rFonts w:ascii="Aptos" w:hAnsi="Aptos"/>
-        <w:b/>
-        <w:color w:val="666666"/>
-        <w:sz w:val="16"/>
+        <w:rFonts w:ascii="Arial" w:hAnsi="Arial" w:eastAsia="Arial"/>
+        <w:b/>
+        <w:color w:val="606060"/>
+        <w:sz w:val="17"/>
       </w:rPr>
       <w:t>RELEVO    TESTEO CONTEXTUAL DE DOS DÍAS</w:t>
     </w:r>
@@ -11747,7 +11843,8 @@
       <w:spacing w:line="259" w:lineRule="auto" w:after="100"/>
     </w:pPr>
     <w:rPr>
-      <w:rFonts w:ascii="Aptos" w:hAnsi="Aptos"/>
+      <w:rFonts w:ascii="Arial" w:hAnsi="Arial" w:eastAsia="Arial"/>
+      <w:color w:val="000000"/>
       <w:sz w:val="21"/>
     </w:rPr>
   </w:style>
@@ -11810,11 +11907,11 @@
       <w:outlineLvl w:val="0"/>
     </w:pPr>
     <w:rPr>
-      <w:rFonts w:asciiTheme="majorHAnsi" w:eastAsiaTheme="majorEastAsia" w:hAnsiTheme="majorHAnsi" w:cstheme="majorBidi" w:ascii="Aptos Display" w:hAnsi="Aptos Display"/>
+      <w:rFonts w:asciiTheme="majorHAnsi" w:eastAsiaTheme="majorEastAsia" w:hAnsiTheme="majorHAnsi" w:cstheme="majorBidi" w:ascii="Arial" w:hAnsi="Arial" w:eastAsia="Arial"/>
       <w:b/>
       <w:bCs/>
       <w:color w:val="000000"/>
-      <w:sz w:val="30"/>
+      <w:sz w:val="34"/>
       <w:szCs w:val="28"/>
     </w:rPr>
   </w:style>
@@ -11834,11 +11931,11 @@
       <w:outlineLvl w:val="1"/>
     </w:pPr>
     <w:rPr>
-      <w:rFonts w:asciiTheme="majorHAnsi" w:eastAsiaTheme="majorEastAsia" w:hAnsiTheme="majorHAnsi" w:cstheme="majorBidi" w:ascii="Aptos Display" w:hAnsi="Aptos Display"/>
+      <w:rFonts w:asciiTheme="majorHAnsi" w:eastAsiaTheme="majorEastAsia" w:hAnsiTheme="majorHAnsi" w:cstheme="majorBidi" w:ascii="Arial" w:hAnsi="Arial" w:eastAsia="Arial"/>
       <w:b/>
       <w:bCs/>
       <w:color w:val="000000"/>
-      <w:sz w:val="23"/>
+      <w:sz w:val="24"/>
       <w:szCs w:val="26"/>
     </w:rPr>
   </w:style>
@@ -11858,10 +11955,11 @@
       <w:outlineLvl w:val="2"/>
     </w:pPr>
     <w:rPr>
-      <w:rFonts w:asciiTheme="majorHAnsi" w:eastAsiaTheme="majorEastAsia" w:hAnsiTheme="majorHAnsi" w:cstheme="majorBidi"/>
+      <w:rFonts w:asciiTheme="majorHAnsi" w:eastAsiaTheme="majorEastAsia" w:hAnsiTheme="majorHAnsi" w:cstheme="majorBidi" w:ascii="Arial" w:hAnsi="Arial" w:eastAsia="Arial"/>
       <w:b/>
       <w:bCs/>
-      <w:color w:val="4F81BD" w:themeColor="accent1"/>
+      <w:color w:val="000000"/>
+      <w:sz w:val="21"/>
     </w:rPr>
   </w:style>
   <w:style w:type="paragraph" w:styleId="Heading4">
@@ -12096,12 +12194,12 @@
       <w:contextualSpacing/>
     </w:pPr>
     <w:rPr>
-      <w:rFonts w:asciiTheme="majorHAnsi" w:eastAsiaTheme="majorEastAsia" w:hAnsiTheme="majorHAnsi" w:cstheme="majorBidi" w:ascii="Aptos Display" w:hAnsi="Aptos Display"/>
+      <w:rFonts w:asciiTheme="majorHAnsi" w:eastAsiaTheme="majorEastAsia" w:hAnsiTheme="majorHAnsi" w:cstheme="majorBidi" w:ascii="Arial" w:hAnsi="Arial" w:eastAsia="Arial"/>
       <w:b/>
       <w:color w:val="000000"/>
       <w:spacing w:val="5"/>
       <w:kern w:val="28"/>
-      <w:sz w:val="54"/>
+      <w:sz w:val="48"/>
       <w:szCs w:val="52"/>
     </w:rPr>
   </w:style>
@@ -12134,12 +12232,12 @@
       </w:numPr>
     </w:pPr>
     <w:rPr>
-      <w:rFonts w:asciiTheme="majorHAnsi" w:eastAsiaTheme="majorEastAsia" w:hAnsiTheme="majorHAnsi" w:cstheme="majorBidi"/>
+      <w:rFonts w:asciiTheme="majorHAnsi" w:eastAsiaTheme="majorEastAsia" w:hAnsiTheme="majorHAnsi" w:cstheme="majorBidi" w:ascii="Arial" w:hAnsi="Arial" w:eastAsia="Arial"/>
       <w:i/>
       <w:iCs/>
-      <w:color w:val="4F81BD" w:themeColor="accent1"/>
+      <w:color w:val="000000"/>
       <w:spacing w:val="15"/>
-      <w:sz w:val="24"/>
+      <w:sz w:val="26"/>
       <w:szCs w:val="24"/>
     </w:rPr>
   </w:style>

</xml_diff>